<commit_message>
Clarify matching answer feedback
</commit_message>
<xml_diff>
--- a/mod/scorm/studytopic/samples/Real_Herb_Comparison_Matching_Polished_Preview.docx
+++ b/mod/scorm/studytopic/samples/Real_Herb_Comparison_Matching_Polished_Preview.docx
@@ -449,7 +449,25 @@
         <w:rPr>
           <w:color w:val="245B38"/>
         </w:rPr>
-        <w:t xml:space="preserve">For the matching exercise “Comparison Alpiniae officinarum Rhizoma (gao liang jiang) Vs. Zingiberis Rhizoma recens (sheng jiang)”, the pairings shown under Correct matches are the keyed relationships from the source activity.</w:t>
+        <w:t xml:space="preserve">For the matching exercise “Comparison Alpiniae officinarum Rhizoma (gao liang jiang) Vs. Zingiberis Rhizoma recens (sheng jiang)”, the source key distinguishes the items by their classification and keyed associations, not by shared symptoms or actions alone.</w:t>
+      </w:r>
+      <w:r>
+        <w:br/>
+      </w:r>
+      <w:r>
+        <w:rPr>
+          <w:color w:val="245B38"/>
+        </w:rPr>
+        <w:t xml:space="preserve">Match 1 — Alpiniae officinarum Rhizoma (gao liang jiang): classified as Herbs that Warm the Interior and Expel Cold; paired with the 2 formula associations shown in its Correct match card.</w:t>
+      </w:r>
+      <w:r>
+        <w:br/>
+      </w:r>
+      <w:r>
+        <w:rPr>
+          <w:color w:val="245B38"/>
+        </w:rPr>
+        <w:t xml:space="preserve">Match 2 — Zingiberis Rhizoma recens (sheng jiang): classified as Warm, Acrid Herbs that Release the Exterior; paired with the 6 formula associations shown in its Correct match card.</w:t>
       </w:r>
     </w:p>
     <w:p>
@@ -479,7 +497,7 @@
         <w:rPr>
           <w:color w:val="6B3030"/>
         </w:rPr>
-        <w:t xml:space="preserve">Each item must be paired with its keyed match shown above. A different pairing is evaluated as incorrect by the source activity.</w:t>
+        <w:t xml:space="preserve">Keep each item with the classification and association group shown in its numbered card. Interchanging the groups for Alpiniae officinarum Rhizoma (gao liang jiang) and Zingiberis Rhizoma recens (sheng jiang) would attach the source associations to the wrong item and is evaluated as an incorrect match.</w:t>
       </w:r>
     </w:p>
     <w:p>

</xml_diff>

<commit_message>
Present matching answers as compact cards
</commit_message>
<xml_diff>
--- a/mod/scorm/studytopic/samples/Real_Herb_Comparison_Matching_Polished_Preview.docx
+++ b/mod/scorm/studytopic/samples/Real_Herb_Comparison_Matching_Polished_Preview.docx
@@ -246,180 +246,438 @@
         <w:t xml:space="preserve">Correct matches</w:t>
       </w:r>
     </w:p>
-    <w:p>
-      <w:pPr>
-        <w:keepLines/>
-        <w:spacing w:before="80" w:after="120"/>
-        <w:ind w:left="180" w:right="120"/>
-        <w:shd w:val="clear" w:color="auto" w:fill="EAF6EE"/>
-        <w:pBdr>
-          <w:left w:val="single" w:sz="20" w:space="8" w:color="2E8B57"/>
-        </w:pBdr>
-      </w:pPr>
-      <w:r>
-        <w:rPr>
-          <w:b/>
-          <w:color w:val="167A3A"/>
-        </w:rPr>
-        <w:t xml:space="preserve">Match 1</w:t>
-      </w:r>
-      <w:r>
-        <w:br/>
-      </w:r>
-      <w:r>
-        <w:rPr>
-          <w:b/>
-          <w:color w:val="167A3A"/>
-        </w:rPr>
-        <w:t xml:space="preserve">Item: Alpiniae officinarum Rhizoma (gao liang jiang)</w:t>
-      </w:r>
-      <w:r>
-        <w:br/>
-      </w:r>
-      <w:r>
-        <w:rPr>
-          <w:b/>
-          <w:color w:val="167A3A"/>
-        </w:rPr>
-        <w:t xml:space="preserve">Category: Herbs that Warm the Interior and Expel Cold.</w:t>
-      </w:r>
-      <w:r>
-        <w:br/>
-      </w:r>
-      <w:r>
-        <w:rPr>
-          <w:b/>
-          <w:color w:val="167A3A"/>
-        </w:rPr>
-        <w:t xml:space="preserve">Correct match: Formulas:</w:t>
-      </w:r>
-      <w:r>
-        <w:br/>
-      </w:r>
-      <w:r>
-        <w:rPr>
-          <w:b/>
-          <w:color w:val="167A3A"/>
-        </w:rPr>
-        <w:t xml:space="preserve">Galangal and Cyperus Pill (liang fu wan)</w:t>
-      </w:r>
-      <w:r>
-        <w:br/>
-      </w:r>
-      <w:r>
-        <w:rPr>
-          <w:b/>
-          <w:color w:val="167A3A"/>
-        </w:rPr>
-        <w:t xml:space="preserve">Top Quality Lindera Powder (tian tai wu yao san)</w:t>
-      </w:r>
-    </w:p>
-    <w:p>
-      <w:pPr>
-        <w:keepLines/>
-        <w:spacing w:before="80" w:after="120"/>
-        <w:ind w:left="180" w:right="120"/>
-        <w:shd w:val="clear" w:color="auto" w:fill="EAF6EE"/>
-        <w:pBdr>
-          <w:left w:val="single" w:sz="20" w:space="8" w:color="2E8B57"/>
-        </w:pBdr>
-      </w:pPr>
-      <w:r>
-        <w:rPr>
-          <w:b/>
-          <w:color w:val="167A3A"/>
-        </w:rPr>
-        <w:t xml:space="preserve">Match 2</w:t>
-      </w:r>
-      <w:r>
-        <w:br/>
-      </w:r>
-      <w:r>
-        <w:rPr>
-          <w:b/>
-          <w:color w:val="167A3A"/>
-        </w:rPr>
-        <w:t xml:space="preserve">Item: Zingiberis Rhizoma recens (sheng jiang)</w:t>
-      </w:r>
-      <w:r>
-        <w:br/>
-      </w:r>
-      <w:r>
-        <w:rPr>
-          <w:b/>
-          <w:color w:val="167A3A"/>
-        </w:rPr>
-        <w:t xml:space="preserve">Category: Warm, Acrid Herbs that Release the Exterior.</w:t>
-      </w:r>
-      <w:r>
-        <w:br/>
-      </w:r>
-      <w:r>
-        <w:rPr>
-          <w:b/>
-          <w:color w:val="167A3A"/>
-        </w:rPr>
-        <w:t xml:space="preserve">Correct match: Formulas:</w:t>
-      </w:r>
-      <w:r>
-        <w:br/>
-      </w:r>
-      <w:r>
-        <w:rPr>
-          <w:b/>
-          <w:color w:val="167A3A"/>
-        </w:rPr>
-        <w:t xml:space="preserve">Apricot Kernel and Perilla Leaf Powder (xing su san).</w:t>
-      </w:r>
-      <w:r>
-        <w:br/>
-      </w:r>
-      <w:r>
-        <w:rPr>
-          <w:b/>
-          <w:color w:val="167A3A"/>
-        </w:rPr>
-        <w:t xml:space="preserve">Cinnamon Twig Decoction (gui zhi tang)</w:t>
-      </w:r>
-      <w:r>
-        <w:br/>
-      </w:r>
-      <w:r>
-        <w:rPr>
-          <w:b/>
-          <w:color w:val="167A3A"/>
-        </w:rPr>
-        <w:t xml:space="preserve">Warm the Gallbladder Decoction (wen dan tang)</w:t>
-      </w:r>
-      <w:r>
-        <w:br/>
-      </w:r>
-      <w:r>
-        <w:rPr>
-          <w:b/>
-          <w:color w:val="167A3A"/>
-        </w:rPr>
-        <w:t xml:space="preserve">Restore the Spleen Decoction (gui pi tang)</w:t>
-      </w:r>
-      <w:r>
-        <w:br/>
-      </w:r>
-      <w:r>
-        <w:rPr>
-          <w:b/>
-          <w:color w:val="167A3A"/>
-        </w:rPr>
-        <w:t xml:space="preserve">Tangerine Peel and Bamboo Shavings Decoction (ju pi zhu ru tang)</w:t>
-      </w:r>
-      <w:r>
-        <w:br/>
-      </w:r>
-      <w:r>
-        <w:rPr>
-          <w:b/>
-          <w:color w:val="167A3A"/>
-        </w:rPr>
-        <w:t xml:space="preserve">Minor Bupleurum Decoction (xiao chai hu tang)</w:t>
+    <w:tbl>
+      <w:tblPr>
+        <w:tblW w:w="9000" w:type="dxa"/>
+        <w:tblLayout w:type="fixed"/>
+        <w:tblBorders>
+          <w:top w:val="single" w:sz="8" w:color="D6E1E7"/>
+          <w:left w:val="single" w:sz="8" w:color="D6E1E7"/>
+          <w:bottom w:val="single" w:sz="8" w:color="D6E1E7"/>
+          <w:right w:val="single" w:sz="8" w:color="D6E1E7"/>
+          <w:insideH w:val="single" w:sz="6" w:color="D6E1E7"/>
+          <w:insideV w:val="single" w:sz="6" w:color="D6E1E7"/>
+        </w:tblBorders>
+        <w:tblCellMar>
+          <w:top w:w="100" w:type="dxa"/>
+          <w:left w:w="120" w:type="dxa"/>
+          <w:bottom w:w="100" w:type="dxa"/>
+          <w:right w:w="120" w:type="dxa"/>
+        </w:tblCellMar>
+      </w:tblPr>
+      <w:tblGrid>
+        <w:gridCol w:w="1900"/>
+        <w:gridCol w:w="7100"/>
+      </w:tblGrid>
+      <w:tr>
+        <w:trPr>
+          <w:cantSplit/>
+        </w:trPr>
+        <w:tc>
+          <w:tcPr>
+            <w:gridSpan w:val="2"/>
+            <w:shd w:val="clear" w:color="auto" w:fill="F47E2C"/>
+          </w:tcPr>
+          <w:p>
+            <w:pPr>
+              <w:keepLines/>
+              <w:spacing w:before="0" w:after="0"/>
+            </w:pPr>
+            <w:r>
+              <w:rPr>
+                <w:b/>
+                <w:color w:val="FFFFFF"/>
+                <w:sz w:val="22"/>
+                <w:szCs w:val="22"/>
+              </w:rPr>
+              <w:t xml:space="preserve">Match 1</w:t>
+            </w:r>
+          </w:p>
+        </w:tc>
+      </w:tr>
+      <w:tr>
+        <w:trPr>
+          <w:cantSplit/>
+        </w:trPr>
+        <w:tc>
+          <w:tcPr>
+            <w:tcW w:w="1900" w:type="dxa"/>
+            <w:shd w:val="clear" w:color="auto" w:fill="F2F6F8"/>
+            <w:vAlign w:val="top"/>
+          </w:tcPr>
+          <w:p>
+            <w:pPr>
+              <w:keepLines/>
+              <w:spacing w:before="0" w:after="0"/>
+            </w:pPr>
+            <w:r>
+              <w:rPr>
+                <w:b/>
+                <w:color w:val="17324D"/>
+              </w:rPr>
+              <w:t xml:space="preserve">Item</w:t>
+            </w:r>
+          </w:p>
+        </w:tc>
+        <w:tc>
+          <w:tcPr>
+            <w:tcW w:w="7100" w:type="dxa"/>
+            <w:shd w:val="clear" w:color="auto" w:fill="FFFFFF"/>
+            <w:vAlign w:val="top"/>
+          </w:tcPr>
+          <w:p>
+            <w:pPr>
+              <w:keepLines/>
+              <w:spacing w:before="0" w:after="0"/>
+            </w:pPr>
+            <w:r>
+              <w:rPr>
+                <w:color w:val="203040"/>
+              </w:rPr>
+              <w:t xml:space="preserve">Alpiniae officinarum Rhizoma (gao liang jiang)</w:t>
+            </w:r>
+          </w:p>
+        </w:tc>
+      </w:tr>
+      <w:tr>
+        <w:trPr>
+          <w:cantSplit/>
+        </w:trPr>
+        <w:tc>
+          <w:tcPr>
+            <w:tcW w:w="1900" w:type="dxa"/>
+            <w:shd w:val="clear" w:color="auto" w:fill="F2F6F8"/>
+            <w:vAlign w:val="top"/>
+          </w:tcPr>
+          <w:p>
+            <w:pPr>
+              <w:keepLines/>
+              <w:spacing w:before="0" w:after="0"/>
+            </w:pPr>
+            <w:r>
+              <w:rPr>
+                <w:b/>
+                <w:color w:val="17324D"/>
+              </w:rPr>
+              <w:t xml:space="preserve">Category</w:t>
+            </w:r>
+          </w:p>
+        </w:tc>
+        <w:tc>
+          <w:tcPr>
+            <w:tcW w:w="7100" w:type="dxa"/>
+            <w:shd w:val="clear" w:color="auto" w:fill="FFFFFF"/>
+            <w:vAlign w:val="top"/>
+          </w:tcPr>
+          <w:p>
+            <w:pPr>
+              <w:keepLines/>
+              <w:spacing w:before="0" w:after="0"/>
+            </w:pPr>
+            <w:r>
+              <w:rPr>
+                <w:color w:val="203040"/>
+              </w:rPr>
+              <w:t xml:space="preserve">Herbs that Warm the Interior and Expel Cold.</w:t>
+            </w:r>
+          </w:p>
+        </w:tc>
+      </w:tr>
+      <w:tr>
+        <w:trPr>
+          <w:cantSplit/>
+        </w:trPr>
+        <w:tc>
+          <w:tcPr>
+            <w:tcW w:w="1900" w:type="dxa"/>
+            <w:shd w:val="clear" w:color="auto" w:fill="F2F6F8"/>
+            <w:vAlign w:val="top"/>
+          </w:tcPr>
+          <w:p>
+            <w:pPr>
+              <w:keepLines/>
+              <w:spacing w:before="0" w:after="0"/>
+            </w:pPr>
+            <w:r>
+              <w:rPr>
+                <w:b/>
+                <w:color w:val="17324D"/>
+              </w:rPr>
+              <w:t xml:space="preserve">Formulas (2)</w:t>
+            </w:r>
+          </w:p>
+        </w:tc>
+        <w:tc>
+          <w:tcPr>
+            <w:tcW w:w="7100" w:type="dxa"/>
+            <w:shd w:val="clear" w:color="auto" w:fill="FFFFFF"/>
+            <w:vAlign w:val="top"/>
+          </w:tcPr>
+          <w:p>
+            <w:pPr>
+              <w:keepLines/>
+              <w:spacing w:before="0" w:after="0"/>
+            </w:pPr>
+            <w:r>
+              <w:rPr>
+                <w:color w:val="203040"/>
+              </w:rPr>
+              <w:t xml:space="preserve">• Galangal and Cyperus Pill (liang fu wan)</w:t>
+            </w:r>
+            <w:r>
+              <w:br/>
+            </w:r>
+            <w:r>
+              <w:rPr>
+                <w:color w:val="203040"/>
+              </w:rPr>
+              <w:t xml:space="preserve">• Top Quality Lindera Powder (tian tai wu yao san)</w:t>
+            </w:r>
+          </w:p>
+        </w:tc>
+      </w:tr>
+    </w:tbl>
+    <w:p>
+      <w:pPr>
+        <w:spacing w:before="0" w:after="120"/>
+      </w:pPr>
+      <w:r>
+        <w:t xml:space="preserve"/>
+      </w:r>
+    </w:p>
+    <w:tbl>
+      <w:tblPr>
+        <w:tblW w:w="9000" w:type="dxa"/>
+        <w:tblLayout w:type="fixed"/>
+        <w:tblBorders>
+          <w:top w:val="single" w:sz="8" w:color="D6E1E7"/>
+          <w:left w:val="single" w:sz="8" w:color="D6E1E7"/>
+          <w:bottom w:val="single" w:sz="8" w:color="D6E1E7"/>
+          <w:right w:val="single" w:sz="8" w:color="D6E1E7"/>
+          <w:insideH w:val="single" w:sz="6" w:color="D6E1E7"/>
+          <w:insideV w:val="single" w:sz="6" w:color="D6E1E7"/>
+        </w:tblBorders>
+        <w:tblCellMar>
+          <w:top w:w="100" w:type="dxa"/>
+          <w:left w:w="120" w:type="dxa"/>
+          <w:bottom w:w="100" w:type="dxa"/>
+          <w:right w:w="120" w:type="dxa"/>
+        </w:tblCellMar>
+      </w:tblPr>
+      <w:tblGrid>
+        <w:gridCol w:w="1900"/>
+        <w:gridCol w:w="7100"/>
+      </w:tblGrid>
+      <w:tr>
+        <w:trPr>
+          <w:cantSplit/>
+        </w:trPr>
+        <w:tc>
+          <w:tcPr>
+            <w:gridSpan w:val="2"/>
+            <w:shd w:val="clear" w:color="auto" w:fill="F47E2C"/>
+          </w:tcPr>
+          <w:p>
+            <w:pPr>
+              <w:keepLines/>
+              <w:spacing w:before="0" w:after="0"/>
+            </w:pPr>
+            <w:r>
+              <w:rPr>
+                <w:b/>
+                <w:color w:val="FFFFFF"/>
+                <w:sz w:val="22"/>
+                <w:szCs w:val="22"/>
+              </w:rPr>
+              <w:t xml:space="preserve">Match 2</w:t>
+            </w:r>
+          </w:p>
+        </w:tc>
+      </w:tr>
+      <w:tr>
+        <w:trPr>
+          <w:cantSplit/>
+        </w:trPr>
+        <w:tc>
+          <w:tcPr>
+            <w:tcW w:w="1900" w:type="dxa"/>
+            <w:shd w:val="clear" w:color="auto" w:fill="F2F6F8"/>
+            <w:vAlign w:val="top"/>
+          </w:tcPr>
+          <w:p>
+            <w:pPr>
+              <w:keepLines/>
+              <w:spacing w:before="0" w:after="0"/>
+            </w:pPr>
+            <w:r>
+              <w:rPr>
+                <w:b/>
+                <w:color w:val="17324D"/>
+              </w:rPr>
+              <w:t xml:space="preserve">Item</w:t>
+            </w:r>
+          </w:p>
+        </w:tc>
+        <w:tc>
+          <w:tcPr>
+            <w:tcW w:w="7100" w:type="dxa"/>
+            <w:shd w:val="clear" w:color="auto" w:fill="FFFFFF"/>
+            <w:vAlign w:val="top"/>
+          </w:tcPr>
+          <w:p>
+            <w:pPr>
+              <w:keepLines/>
+              <w:spacing w:before="0" w:after="0"/>
+            </w:pPr>
+            <w:r>
+              <w:rPr>
+                <w:color w:val="203040"/>
+              </w:rPr>
+              <w:t xml:space="preserve">Zingiberis Rhizoma recens (sheng jiang)</w:t>
+            </w:r>
+          </w:p>
+        </w:tc>
+      </w:tr>
+      <w:tr>
+        <w:trPr>
+          <w:cantSplit/>
+        </w:trPr>
+        <w:tc>
+          <w:tcPr>
+            <w:tcW w:w="1900" w:type="dxa"/>
+            <w:shd w:val="clear" w:color="auto" w:fill="F2F6F8"/>
+            <w:vAlign w:val="top"/>
+          </w:tcPr>
+          <w:p>
+            <w:pPr>
+              <w:keepLines/>
+              <w:spacing w:before="0" w:after="0"/>
+            </w:pPr>
+            <w:r>
+              <w:rPr>
+                <w:b/>
+                <w:color w:val="17324D"/>
+              </w:rPr>
+              <w:t xml:space="preserve">Category</w:t>
+            </w:r>
+          </w:p>
+        </w:tc>
+        <w:tc>
+          <w:tcPr>
+            <w:tcW w:w="7100" w:type="dxa"/>
+            <w:shd w:val="clear" w:color="auto" w:fill="FFFFFF"/>
+            <w:vAlign w:val="top"/>
+          </w:tcPr>
+          <w:p>
+            <w:pPr>
+              <w:keepLines/>
+              <w:spacing w:before="0" w:after="0"/>
+            </w:pPr>
+            <w:r>
+              <w:rPr>
+                <w:color w:val="203040"/>
+              </w:rPr>
+              <w:t xml:space="preserve">Warm, Acrid Herbs that Release the Exterior.</w:t>
+            </w:r>
+          </w:p>
+        </w:tc>
+      </w:tr>
+      <w:tr>
+        <w:trPr>
+          <w:cantSplit/>
+        </w:trPr>
+        <w:tc>
+          <w:tcPr>
+            <w:tcW w:w="1900" w:type="dxa"/>
+            <w:shd w:val="clear" w:color="auto" w:fill="F2F6F8"/>
+            <w:vAlign w:val="top"/>
+          </w:tcPr>
+          <w:p>
+            <w:pPr>
+              <w:keepLines/>
+              <w:spacing w:before="0" w:after="0"/>
+            </w:pPr>
+            <w:r>
+              <w:rPr>
+                <w:b/>
+                <w:color w:val="17324D"/>
+              </w:rPr>
+              <w:t xml:space="preserve">Formulas (6)</w:t>
+            </w:r>
+          </w:p>
+        </w:tc>
+        <w:tc>
+          <w:tcPr>
+            <w:tcW w:w="7100" w:type="dxa"/>
+            <w:shd w:val="clear" w:color="auto" w:fill="FFFFFF"/>
+            <w:vAlign w:val="top"/>
+          </w:tcPr>
+          <w:p>
+            <w:pPr>
+              <w:keepLines/>
+              <w:spacing w:before="0" w:after="0"/>
+            </w:pPr>
+            <w:r>
+              <w:rPr>
+                <w:color w:val="203040"/>
+              </w:rPr>
+              <w:t xml:space="preserve">• Apricot Kernel and Perilla Leaf Powder (xing su san).</w:t>
+            </w:r>
+            <w:r>
+              <w:br/>
+            </w:r>
+            <w:r>
+              <w:rPr>
+                <w:color w:val="203040"/>
+              </w:rPr>
+              <w:t xml:space="preserve">• Cinnamon Twig Decoction (gui zhi tang)</w:t>
+            </w:r>
+            <w:r>
+              <w:br/>
+            </w:r>
+            <w:r>
+              <w:rPr>
+                <w:color w:val="203040"/>
+              </w:rPr>
+              <w:t xml:space="preserve">• Warm the Gallbladder Decoction (wen dan tang)</w:t>
+            </w:r>
+            <w:r>
+              <w:br/>
+            </w:r>
+            <w:r>
+              <w:rPr>
+                <w:color w:val="203040"/>
+              </w:rPr>
+              <w:t xml:space="preserve">• Restore the Spleen Decoction (gui pi tang)</w:t>
+            </w:r>
+            <w:r>
+              <w:br/>
+            </w:r>
+            <w:r>
+              <w:rPr>
+                <w:color w:val="203040"/>
+              </w:rPr>
+              <w:t xml:space="preserve">• Tangerine Peel and Bamboo Shavings Decoction (ju pi zhu ru tang)</w:t>
+            </w:r>
+            <w:r>
+              <w:br/>
+            </w:r>
+            <w:r>
+              <w:rPr>
+                <w:color w:val="203040"/>
+              </w:rPr>
+              <w:t xml:space="preserve">• Minor Bupleurum Decoction (xiao chai hu tang)</w:t>
+            </w:r>
+          </w:p>
+        </w:tc>
+      </w:tr>
+    </w:tbl>
+    <w:p>
+      <w:pPr>
+        <w:spacing w:before="0" w:after="120"/>
+      </w:pPr>
+      <w:r>
+        <w:t xml:space="preserve"/>
       </w:r>
     </w:p>
     <w:p>

</xml_diff>

<commit_message>
Separate matching clues into study tips
</commit_message>
<xml_diff>
--- a/mod/scorm/studytopic/samples/Real_Herb_Comparison_Matching_Polished_Preview.docx
+++ b/mod/scorm/studytopic/samples/Real_Herb_Comparison_Matching_Polished_Preview.docx
@@ -188,7 +188,7 @@
     <w:p>
       <w:pPr>
         <w:keepLines/>
-        <w:spacing w:before="0" w:after="150"/>
+        <w:spacing w:before="0" w:after="120"/>
         <w:ind w:left="180" w:right="120"/>
       </w:pPr>
       <w:r>
@@ -198,52 +198,6 @@
           <w:szCs w:val="22"/>
         </w:rPr>
         <w:t xml:space="preserve">Comparison Alpiniae officinarum Rhizoma (gao liang jiang) Vs. Zingiberis Rhizoma recens (sheng jiang)</w:t>
-      </w:r>
-      <w:r>
-        <w:br/>
-      </w:r>
-      <w:r>
-        <w:rPr>
-          <w:b/>
-          <w:sz w:val="22"/>
-          <w:szCs w:val="22"/>
-        </w:rPr>
-        <w:t xml:space="preserve">Both herbs warm the middle, disperse cold, and settle nausea.</w:t>
-      </w:r>
-      <w:r>
-        <w:br/>
-      </w:r>
-      <w:r>
-        <w:rPr>
-          <w:b/>
-          <w:sz w:val="22"/>
-          <w:szCs w:val="22"/>
-        </w:rPr>
-        <w:t xml:space="preserve">Primary conditions or symptoms for which Gao Liang jiang may be prescribed: Abdominal pain. Vomiting. Diarrhea. Acid reflux. Loss of appetite.</w:t>
-      </w:r>
-      <w:r>
-        <w:br/>
-      </w:r>
-      <w:r>
-        <w:rPr>
-          <w:b/>
-          <w:sz w:val="22"/>
-          <w:szCs w:val="22"/>
-        </w:rPr>
-        <w:t xml:space="preserve">Primary conditions or symptoms for which Sheng Jiang may be prescribed: Common cold. Nasal congestion. Coughing. Food poisoning from seafood .Loss of appetite. Morning sickness. Vomiting. Phlegm. Drug poisoning.</w:t>
-      </w:r>
-    </w:p>
-    <w:p>
-      <w:pPr>
-        <w:keepNext/>
-        <w:spacing w:before="0" w:after="100"/>
-      </w:pPr>
-      <w:r>
-        <w:rPr>
-          <w:b/>
-          <w:color w:val="17324D"/>
-        </w:rPr>
-        <w:t xml:space="preserve">Correct matches</w:t>
       </w:r>
     </w:p>
     <w:tbl>
@@ -276,10 +230,11 @@
         <w:tc>
           <w:tcPr>
             <w:gridSpan w:val="2"/>
-            <w:shd w:val="clear" w:color="auto" w:fill="F47E2C"/>
-          </w:tcPr>
-          <w:p>
-            <w:pPr>
+            <w:shd w:val="clear" w:color="auto" w:fill="527286"/>
+          </w:tcPr>
+          <w:p>
+            <w:pPr>
+              <w:keepNext/>
               <w:keepLines/>
               <w:spacing w:before="0" w:after="0"/>
             </w:pPr>
@@ -290,7 +245,7 @@
                 <w:sz w:val="22"/>
                 <w:szCs w:val="22"/>
               </w:rPr>
-              <w:t xml:space="preserve">Match 1</w:t>
+              <w:t xml:space="preserve">Study tip · Clues to help answer</w:t>
             </w:r>
           </w:p>
         </w:tc>
@@ -307,6 +262,7 @@
           </w:tcPr>
           <w:p>
             <w:pPr>
+              <w:keepNext/>
               <w:keepLines/>
               <w:spacing w:before="0" w:after="0"/>
             </w:pPr>
@@ -315,7 +271,7 @@
                 <w:b/>
                 <w:color w:val="17324D"/>
               </w:rPr>
-              <w:t xml:space="preserve">Item</w:t>
+              <w:t xml:space="preserve">Shared clues</w:t>
             </w:r>
           </w:p>
         </w:tc>
@@ -327,14 +283,15 @@
           </w:tcPr>
           <w:p>
             <w:pPr>
-              <w:keepLines/>
-              <w:spacing w:before="0" w:after="0"/>
-            </w:pPr>
-            <w:r>
-              <w:rPr>
-                <w:color w:val="203040"/>
-              </w:rPr>
-              <w:t xml:space="preserve">Alpiniae officinarum Rhizoma (gao liang jiang)</w:t>
+              <w:keepNext/>
+              <w:keepLines/>
+              <w:spacing w:before="0" w:after="0"/>
+            </w:pPr>
+            <w:r>
+              <w:rPr>
+                <w:color w:val="203040"/>
+              </w:rPr>
+              <w:t xml:space="preserve">Both herbs warm the middle, disperse cold, and settle nausea.</w:t>
             </w:r>
           </w:p>
         </w:tc>
@@ -351,6 +308,7 @@
           </w:tcPr>
           <w:p>
             <w:pPr>
+              <w:keepNext/>
               <w:keepLines/>
               <w:spacing w:before="0" w:after="0"/>
             </w:pPr>
@@ -359,7 +317,7 @@
                 <w:b/>
                 <w:color w:val="17324D"/>
               </w:rPr>
-              <w:t xml:space="preserve">Category</w:t>
+              <w:t xml:space="preserve">Gao Liang jiang</w:t>
             </w:r>
           </w:p>
         </w:tc>
@@ -371,14 +329,51 @@
           </w:tcPr>
           <w:p>
             <w:pPr>
-              <w:keepLines/>
-              <w:spacing w:before="0" w:after="0"/>
-            </w:pPr>
-            <w:r>
-              <w:rPr>
-                <w:color w:val="203040"/>
-              </w:rPr>
-              <w:t xml:space="preserve">Herbs that Warm the Interior and Expel Cold.</w:t>
+              <w:keepNext/>
+              <w:keepLines/>
+              <w:spacing w:before="0" w:after="0"/>
+            </w:pPr>
+            <w:r>
+              <w:rPr>
+                <w:color w:val="203040"/>
+              </w:rPr>
+              <w:t xml:space="preserve">• Abdominal pain</w:t>
+            </w:r>
+            <w:r>
+              <w:br/>
+            </w:r>
+            <w:r>
+              <w:rPr>
+                <w:color w:val="203040"/>
+              </w:rPr>
+              <w:t xml:space="preserve">• Vomiting</w:t>
+            </w:r>
+            <w:r>
+              <w:br/>
+            </w:r>
+            <w:r>
+              <w:rPr>
+                <w:color w:val="203040"/>
+              </w:rPr>
+              <w:t xml:space="preserve">• Diarrhea</w:t>
+            </w:r>
+            <w:r>
+              <w:br/>
+            </w:r>
+            <w:r>
+              <w:rPr>
+                <w:color w:val="203040"/>
+              </w:rPr>
+              <w:t xml:space="preserve">• Acid reflux</w:t>
+            </w:r>
+            <w:r>
+              <w:br/>
+            </w:r>
+            <w:r>
+              <w:rPr>
+                <w:color w:val="203040"/>
+              </w:rPr>
+              <w:t xml:space="preserve">• Loss of appetite</w:t>
             </w:r>
           </w:p>
         </w:tc>
@@ -403,7 +398,7 @@
                 <w:b/>
                 <w:color w:val="17324D"/>
               </w:rPr>
-              <w:t xml:space="preserve">Formulas (2)</w:t>
+              <w:t xml:space="preserve">Sheng Jiang</w:t>
             </w:r>
           </w:p>
         </w:tc>
@@ -422,16 +417,79 @@
               <w:rPr>
                 <w:color w:val="203040"/>
               </w:rPr>
-              <w:t xml:space="preserve">• Galangal and Cyperus Pill (liang fu wan)</w:t>
-            </w:r>
-            <w:r>
-              <w:br/>
-            </w:r>
-            <w:r>
-              <w:rPr>
-                <w:color w:val="203040"/>
-              </w:rPr>
-              <w:t xml:space="preserve">• Top Quality Lindera Powder (tian tai wu yao san)</w:t>
+              <w:t xml:space="preserve">• Common cold</w:t>
+            </w:r>
+            <w:r>
+              <w:br/>
+            </w:r>
+            <w:r>
+              <w:rPr>
+                <w:color w:val="203040"/>
+              </w:rPr>
+              <w:t xml:space="preserve">• Nasal congestion</w:t>
+            </w:r>
+            <w:r>
+              <w:br/>
+            </w:r>
+            <w:r>
+              <w:rPr>
+                <w:color w:val="203040"/>
+              </w:rPr>
+              <w:t xml:space="preserve">• Coughing</w:t>
+            </w:r>
+            <w:r>
+              <w:br/>
+            </w:r>
+            <w:r>
+              <w:rPr>
+                <w:color w:val="203040"/>
+              </w:rPr>
+              <w:t xml:space="preserve">• Food poisoning from seafood</w:t>
+            </w:r>
+            <w:r>
+              <w:br/>
+            </w:r>
+            <w:r>
+              <w:rPr>
+                <w:color w:val="203040"/>
+              </w:rPr>
+              <w:t xml:space="preserve">• Loss of appetite</w:t>
+            </w:r>
+            <w:r>
+              <w:br/>
+            </w:r>
+            <w:r>
+              <w:rPr>
+                <w:color w:val="203040"/>
+              </w:rPr>
+              <w:t xml:space="preserve">• Morning sickness</w:t>
+            </w:r>
+            <w:r>
+              <w:br/>
+            </w:r>
+            <w:r>
+              <w:rPr>
+                <w:color w:val="203040"/>
+              </w:rPr>
+              <w:t xml:space="preserve">• Vomiting</w:t>
+            </w:r>
+            <w:r>
+              <w:br/>
+            </w:r>
+            <w:r>
+              <w:rPr>
+                <w:color w:val="203040"/>
+              </w:rPr>
+              <w:t xml:space="preserve">• Phlegm</w:t>
+            </w:r>
+            <w:r>
+              <w:br/>
+            </w:r>
+            <w:r>
+              <w:rPr>
+                <w:color w:val="203040"/>
+              </w:rPr>
+              <w:t xml:space="preserve">• Drug poisoning</w:t>
             </w:r>
           </w:p>
         </w:tc>
@@ -443,6 +501,19 @@
       </w:pPr>
       <w:r>
         <w:t xml:space="preserve"/>
+      </w:r>
+    </w:p>
+    <w:p>
+      <w:pPr>
+        <w:keepNext/>
+        <w:spacing w:before="0" w:after="100"/>
+      </w:pPr>
+      <w:r>
+        <w:rPr>
+          <w:b/>
+          <w:color w:val="17324D"/>
+        </w:rPr>
+        <w:t xml:space="preserve">Correct matches</w:t>
       </w:r>
     </w:p>
     <w:tbl>
@@ -479,6 +550,7 @@
           </w:tcPr>
           <w:p>
             <w:pPr>
+              <w:keepNext/>
               <w:keepLines/>
               <w:spacing w:before="0" w:after="0"/>
             </w:pPr>
@@ -489,7 +561,7 @@
                 <w:sz w:val="22"/>
                 <w:szCs w:val="22"/>
               </w:rPr>
-              <w:t xml:space="preserve">Match 2</w:t>
+              <w:t xml:space="preserve">Match 1</w:t>
             </w:r>
           </w:p>
         </w:tc>
@@ -506,6 +578,7 @@
           </w:tcPr>
           <w:p>
             <w:pPr>
+              <w:keepNext/>
               <w:keepLines/>
               <w:spacing w:before="0" w:after="0"/>
             </w:pPr>
@@ -526,14 +599,15 @@
           </w:tcPr>
           <w:p>
             <w:pPr>
-              <w:keepLines/>
-              <w:spacing w:before="0" w:after="0"/>
-            </w:pPr>
-            <w:r>
-              <w:rPr>
-                <w:color w:val="203040"/>
-              </w:rPr>
-              <w:t xml:space="preserve">Zingiberis Rhizoma recens (sheng jiang)</w:t>
+              <w:keepNext/>
+              <w:keepLines/>
+              <w:spacing w:before="0" w:after="0"/>
+            </w:pPr>
+            <w:r>
+              <w:rPr>
+                <w:color w:val="203040"/>
+              </w:rPr>
+              <w:t xml:space="preserve">Alpiniae officinarum Rhizoma (gao liang jiang)</w:t>
             </w:r>
           </w:p>
         </w:tc>
@@ -550,6 +624,7 @@
           </w:tcPr>
           <w:p>
             <w:pPr>
+              <w:keepNext/>
               <w:keepLines/>
               <w:spacing w:before="0" w:after="0"/>
             </w:pPr>
@@ -570,6 +645,211 @@
           </w:tcPr>
           <w:p>
             <w:pPr>
+              <w:keepNext/>
+              <w:keepLines/>
+              <w:spacing w:before="0" w:after="0"/>
+            </w:pPr>
+            <w:r>
+              <w:rPr>
+                <w:color w:val="203040"/>
+              </w:rPr>
+              <w:t xml:space="preserve">Herbs that Warm the Interior and Expel Cold.</w:t>
+            </w:r>
+          </w:p>
+        </w:tc>
+      </w:tr>
+      <w:tr>
+        <w:trPr>
+          <w:cantSplit/>
+        </w:trPr>
+        <w:tc>
+          <w:tcPr>
+            <w:tcW w:w="1900" w:type="dxa"/>
+            <w:shd w:val="clear" w:color="auto" w:fill="F2F6F8"/>
+            <w:vAlign w:val="top"/>
+          </w:tcPr>
+          <w:p>
+            <w:pPr>
+              <w:keepLines/>
+              <w:spacing w:before="0" w:after="0"/>
+            </w:pPr>
+            <w:r>
+              <w:rPr>
+                <w:b/>
+                <w:color w:val="17324D"/>
+              </w:rPr>
+              <w:t xml:space="preserve">Formulas (2)</w:t>
+            </w:r>
+          </w:p>
+        </w:tc>
+        <w:tc>
+          <w:tcPr>
+            <w:tcW w:w="7100" w:type="dxa"/>
+            <w:shd w:val="clear" w:color="auto" w:fill="FFFFFF"/>
+            <w:vAlign w:val="top"/>
+          </w:tcPr>
+          <w:p>
+            <w:pPr>
+              <w:keepLines/>
+              <w:spacing w:before="0" w:after="0"/>
+            </w:pPr>
+            <w:r>
+              <w:rPr>
+                <w:color w:val="203040"/>
+              </w:rPr>
+              <w:t xml:space="preserve">• Galangal and Cyperus Pill (liang fu wan)</w:t>
+            </w:r>
+            <w:r>
+              <w:br/>
+            </w:r>
+            <w:r>
+              <w:rPr>
+                <w:color w:val="203040"/>
+              </w:rPr>
+              <w:t xml:space="preserve">• Top Quality Lindera Powder (tian tai wu yao san)</w:t>
+            </w:r>
+          </w:p>
+        </w:tc>
+      </w:tr>
+    </w:tbl>
+    <w:p>
+      <w:pPr>
+        <w:spacing w:before="0" w:after="120"/>
+      </w:pPr>
+      <w:r>
+        <w:t xml:space="preserve"/>
+      </w:r>
+    </w:p>
+    <w:tbl>
+      <w:tblPr>
+        <w:tblW w:w="9000" w:type="dxa"/>
+        <w:tblLayout w:type="fixed"/>
+        <w:tblBorders>
+          <w:top w:val="single" w:sz="8" w:color="D6E1E7"/>
+          <w:left w:val="single" w:sz="8" w:color="D6E1E7"/>
+          <w:bottom w:val="single" w:sz="8" w:color="D6E1E7"/>
+          <w:right w:val="single" w:sz="8" w:color="D6E1E7"/>
+          <w:insideH w:val="single" w:sz="6" w:color="D6E1E7"/>
+          <w:insideV w:val="single" w:sz="6" w:color="D6E1E7"/>
+        </w:tblBorders>
+        <w:tblCellMar>
+          <w:top w:w="100" w:type="dxa"/>
+          <w:left w:w="120" w:type="dxa"/>
+          <w:bottom w:w="100" w:type="dxa"/>
+          <w:right w:w="120" w:type="dxa"/>
+        </w:tblCellMar>
+      </w:tblPr>
+      <w:tblGrid>
+        <w:gridCol w:w="1900"/>
+        <w:gridCol w:w="7100"/>
+      </w:tblGrid>
+      <w:tr>
+        <w:trPr>
+          <w:cantSplit/>
+        </w:trPr>
+        <w:tc>
+          <w:tcPr>
+            <w:gridSpan w:val="2"/>
+            <w:shd w:val="clear" w:color="auto" w:fill="F47E2C"/>
+          </w:tcPr>
+          <w:p>
+            <w:pPr>
+              <w:keepNext/>
+              <w:keepLines/>
+              <w:spacing w:before="0" w:after="0"/>
+            </w:pPr>
+            <w:r>
+              <w:rPr>
+                <w:b/>
+                <w:color w:val="FFFFFF"/>
+                <w:sz w:val="22"/>
+                <w:szCs w:val="22"/>
+              </w:rPr>
+              <w:t xml:space="preserve">Match 2</w:t>
+            </w:r>
+          </w:p>
+        </w:tc>
+      </w:tr>
+      <w:tr>
+        <w:trPr>
+          <w:cantSplit/>
+        </w:trPr>
+        <w:tc>
+          <w:tcPr>
+            <w:tcW w:w="1900" w:type="dxa"/>
+            <w:shd w:val="clear" w:color="auto" w:fill="F2F6F8"/>
+            <w:vAlign w:val="top"/>
+          </w:tcPr>
+          <w:p>
+            <w:pPr>
+              <w:keepNext/>
+              <w:keepLines/>
+              <w:spacing w:before="0" w:after="0"/>
+            </w:pPr>
+            <w:r>
+              <w:rPr>
+                <w:b/>
+                <w:color w:val="17324D"/>
+              </w:rPr>
+              <w:t xml:space="preserve">Item</w:t>
+            </w:r>
+          </w:p>
+        </w:tc>
+        <w:tc>
+          <w:tcPr>
+            <w:tcW w:w="7100" w:type="dxa"/>
+            <w:shd w:val="clear" w:color="auto" w:fill="FFFFFF"/>
+            <w:vAlign w:val="top"/>
+          </w:tcPr>
+          <w:p>
+            <w:pPr>
+              <w:keepNext/>
+              <w:keepLines/>
+              <w:spacing w:before="0" w:after="0"/>
+            </w:pPr>
+            <w:r>
+              <w:rPr>
+                <w:color w:val="203040"/>
+              </w:rPr>
+              <w:t xml:space="preserve">Zingiberis Rhizoma recens (sheng jiang)</w:t>
+            </w:r>
+          </w:p>
+        </w:tc>
+      </w:tr>
+      <w:tr>
+        <w:trPr>
+          <w:cantSplit/>
+        </w:trPr>
+        <w:tc>
+          <w:tcPr>
+            <w:tcW w:w="1900" w:type="dxa"/>
+            <w:shd w:val="clear" w:color="auto" w:fill="F2F6F8"/>
+            <w:vAlign w:val="top"/>
+          </w:tcPr>
+          <w:p>
+            <w:pPr>
+              <w:keepNext/>
+              <w:keepLines/>
+              <w:spacing w:before="0" w:after="0"/>
+            </w:pPr>
+            <w:r>
+              <w:rPr>
+                <w:b/>
+                <w:color w:val="17324D"/>
+              </w:rPr>
+              <w:t xml:space="preserve">Category</w:t>
+            </w:r>
+          </w:p>
+        </w:tc>
+        <w:tc>
+          <w:tcPr>
+            <w:tcW w:w="7100" w:type="dxa"/>
+            <w:shd w:val="clear" w:color="auto" w:fill="FFFFFF"/>
+            <w:vAlign w:val="top"/>
+          </w:tcPr>
+          <w:p>
+            <w:pPr>
+              <w:keepNext/>
               <w:keepLines/>
               <w:spacing w:before="0" w:after="0"/>
             </w:pPr>

</xml_diff>

<commit_message>
Use side-by-side tables for matching comparisons
</commit_message>
<xml_diff>
--- a/mod/scorm/studytopic/samples/Real_Herb_Comparison_Matching_Polished_Preview.docx
+++ b/mod/scorm/studytopic/samples/Real_Herb_Comparison_Matching_Polished_Preview.docx
@@ -530,14 +530,15 @@
         </w:tblBorders>
         <w:tblCellMar>
           <w:top w:w="100" w:type="dxa"/>
-          <w:left w:w="120" w:type="dxa"/>
+          <w:left w:w="110" w:type="dxa"/>
           <w:bottom w:w="100" w:type="dxa"/>
-          <w:right w:w="120" w:type="dxa"/>
+          <w:right w:w="110" w:type="dxa"/>
         </w:tblCellMar>
       </w:tblPr>
       <w:tblGrid>
-        <w:gridCol w:w="1900"/>
-        <w:gridCol w:w="7100"/>
+        <w:gridCol w:w="1500"/>
+        <w:gridCol w:w="3750"/>
+        <w:gridCol w:w="3750"/>
       </w:tblGrid>
       <w:tr>
         <w:trPr>
@@ -545,8 +546,10 @@
         </w:trPr>
         <w:tc>
           <w:tcPr>
-            <w:gridSpan w:val="2"/>
+            <w:gridSpan w:val="3"/>
+            <w:tcW w:w="9000" w:type="dxa"/>
             <w:shd w:val="clear" w:color="auto" w:fill="F47E2C"/>
+            <w:vAlign w:val="top"/>
           </w:tcPr>
           <w:p>
             <w:pPr>
@@ -558,10 +561,8 @@
               <w:rPr>
                 <w:b/>
                 <w:color w:val="FFFFFF"/>
-                <w:sz w:val="22"/>
-                <w:szCs w:val="22"/>
-              </w:rPr>
-              <w:t xml:space="preserve">Match 1</w:t>
+              </w:rPr>
+              <w:t xml:space="preserve">Comparative answer key</w:t>
             </w:r>
           </w:p>
         </w:tc>
@@ -572,8 +573,8 @@
         </w:trPr>
         <w:tc>
           <w:tcPr>
-            <w:tcW w:w="1900" w:type="dxa"/>
-            <w:shd w:val="clear" w:color="auto" w:fill="F2F6F8"/>
+            <w:tcW w:w="1500" w:type="dxa"/>
+            <w:shd w:val="clear" w:color="auto" w:fill="DDEAF0"/>
             <w:vAlign w:val="top"/>
           </w:tcPr>
           <w:p>
@@ -585,29 +586,51 @@
             <w:r>
               <w:rPr>
                 <w:b/>
-                <w:color w:val="17324D"/>
-              </w:rPr>
-              <w:t xml:space="preserve">Item</w:t>
-            </w:r>
-          </w:p>
-        </w:tc>
-        <w:tc>
-          <w:tcPr>
-            <w:tcW w:w="7100" w:type="dxa"/>
-            <w:shd w:val="clear" w:color="auto" w:fill="FFFFFF"/>
-            <w:vAlign w:val="top"/>
-          </w:tcPr>
-          <w:p>
-            <w:pPr>
-              <w:keepNext/>
-              <w:keepLines/>
-              <w:spacing w:before="0" w:after="0"/>
-            </w:pPr>
-            <w:r>
-              <w:rPr>
+                <w:color w:val="203040"/>
+              </w:rPr>
+              <w:t xml:space="preserve">Compare</w:t>
+            </w:r>
+          </w:p>
+        </w:tc>
+        <w:tc>
+          <w:tcPr>
+            <w:tcW w:w="3750" w:type="dxa"/>
+            <w:shd w:val="clear" w:color="auto" w:fill="DDEAF0"/>
+            <w:vAlign w:val="top"/>
+          </w:tcPr>
+          <w:p>
+            <w:pPr>
+              <w:keepNext/>
+              <w:keepLines/>
+              <w:spacing w:before="0" w:after="0"/>
+            </w:pPr>
+            <w:r>
+              <w:rPr>
+                <w:b/>
                 <w:color w:val="203040"/>
               </w:rPr>
               <w:t xml:space="preserve">Alpiniae officinarum Rhizoma (gao liang jiang)</w:t>
+            </w:r>
+          </w:p>
+        </w:tc>
+        <w:tc>
+          <w:tcPr>
+            <w:tcW w:w="3750" w:type="dxa"/>
+            <w:shd w:val="clear" w:color="auto" w:fill="DDEAF0"/>
+            <w:vAlign w:val="top"/>
+          </w:tcPr>
+          <w:p>
+            <w:pPr>
+              <w:keepNext/>
+              <w:keepLines/>
+              <w:spacing w:before="0" w:after="0"/>
+            </w:pPr>
+            <w:r>
+              <w:rPr>
+                <w:b/>
+                <w:color w:val="203040"/>
+              </w:rPr>
+              <w:t xml:space="preserve">Zingiberis Rhizoma recens (sheng jiang)</w:t>
             </w:r>
           </w:p>
         </w:tc>
@@ -618,7 +641,7 @@
         </w:trPr>
         <w:tc>
           <w:tcPr>
-            <w:tcW w:w="1900" w:type="dxa"/>
+            <w:tcW w:w="1500" w:type="dxa"/>
             <w:shd w:val="clear" w:color="auto" w:fill="F2F6F8"/>
             <w:vAlign w:val="top"/>
           </w:tcPr>
@@ -631,7 +654,7 @@
             <w:r>
               <w:rPr>
                 <w:b/>
-                <w:color w:val="17324D"/>
+                <w:color w:val="203040"/>
               </w:rPr>
               <w:t xml:space="preserve">Category</w:t>
             </w:r>
@@ -639,7 +662,7 @@
         </w:tc>
         <w:tc>
           <w:tcPr>
-            <w:tcW w:w="7100" w:type="dxa"/>
+            <w:tcW w:w="3750" w:type="dxa"/>
             <w:shd w:val="clear" w:color="auto" w:fill="FFFFFF"/>
             <w:vAlign w:val="top"/>
           </w:tcPr>
@@ -654,6 +677,26 @@
                 <w:color w:val="203040"/>
               </w:rPr>
               <w:t xml:space="preserve">Herbs that Warm the Interior and Expel Cold.</w:t>
+            </w:r>
+          </w:p>
+        </w:tc>
+        <w:tc>
+          <w:tcPr>
+            <w:tcW w:w="3750" w:type="dxa"/>
+            <w:shd w:val="clear" w:color="auto" w:fill="FFFFFF"/>
+            <w:vAlign w:val="top"/>
+          </w:tcPr>
+          <w:p>
+            <w:pPr>
+              <w:keepNext/>
+              <w:keepLines/>
+              <w:spacing w:before="0" w:after="0"/>
+            </w:pPr>
+            <w:r>
+              <w:rPr>
+                <w:color w:val="203040"/>
+              </w:rPr>
+              <w:t xml:space="preserve">Warm, Acrid Herbs that Release the Exterior.</w:t>
             </w:r>
           </w:p>
         </w:tc>
@@ -664,7 +707,7 @@
         </w:trPr>
         <w:tc>
           <w:tcPr>
-            <w:tcW w:w="1900" w:type="dxa"/>
+            <w:tcW w:w="1500" w:type="dxa"/>
             <w:shd w:val="clear" w:color="auto" w:fill="F2F6F8"/>
             <w:vAlign w:val="top"/>
           </w:tcPr>
@@ -676,15 +719,15 @@
             <w:r>
               <w:rPr>
                 <w:b/>
-                <w:color w:val="17324D"/>
-              </w:rPr>
-              <w:t xml:space="preserve">Formulas (2)</w:t>
-            </w:r>
-          </w:p>
-        </w:tc>
-        <w:tc>
-          <w:tcPr>
-            <w:tcW w:w="7100" w:type="dxa"/>
+                <w:color w:val="203040"/>
+              </w:rPr>
+              <w:t xml:space="preserve">Formulas</w:t>
+            </w:r>
+          </w:p>
+        </w:tc>
+        <w:tc>
+          <w:tcPr>
+            <w:tcW w:w="3750" w:type="dxa"/>
             <w:shd w:val="clear" w:color="auto" w:fill="FFFFFF"/>
             <w:vAlign w:val="top"/>
           </w:tcPr>
@@ -710,185 +753,9 @@
             </w:r>
           </w:p>
         </w:tc>
-      </w:tr>
-    </w:tbl>
-    <w:p>
-      <w:pPr>
-        <w:spacing w:before="0" w:after="120"/>
-      </w:pPr>
-      <w:r>
-        <w:t xml:space="preserve"/>
-      </w:r>
-    </w:p>
-    <w:tbl>
-      <w:tblPr>
-        <w:tblW w:w="9000" w:type="dxa"/>
-        <w:tblLayout w:type="fixed"/>
-        <w:tblBorders>
-          <w:top w:val="single" w:sz="8" w:color="D6E1E7"/>
-          <w:left w:val="single" w:sz="8" w:color="D6E1E7"/>
-          <w:bottom w:val="single" w:sz="8" w:color="D6E1E7"/>
-          <w:right w:val="single" w:sz="8" w:color="D6E1E7"/>
-          <w:insideH w:val="single" w:sz="6" w:color="D6E1E7"/>
-          <w:insideV w:val="single" w:sz="6" w:color="D6E1E7"/>
-        </w:tblBorders>
-        <w:tblCellMar>
-          <w:top w:w="100" w:type="dxa"/>
-          <w:left w:w="120" w:type="dxa"/>
-          <w:bottom w:w="100" w:type="dxa"/>
-          <w:right w:w="120" w:type="dxa"/>
-        </w:tblCellMar>
-      </w:tblPr>
-      <w:tblGrid>
-        <w:gridCol w:w="1900"/>
-        <w:gridCol w:w="7100"/>
-      </w:tblGrid>
-      <w:tr>
-        <w:trPr>
-          <w:cantSplit/>
-        </w:trPr>
-        <w:tc>
-          <w:tcPr>
-            <w:gridSpan w:val="2"/>
-            <w:shd w:val="clear" w:color="auto" w:fill="F47E2C"/>
-          </w:tcPr>
-          <w:p>
-            <w:pPr>
-              <w:keepNext/>
-              <w:keepLines/>
-              <w:spacing w:before="0" w:after="0"/>
-            </w:pPr>
-            <w:r>
-              <w:rPr>
-                <w:b/>
-                <w:color w:val="FFFFFF"/>
-                <w:sz w:val="22"/>
-                <w:szCs w:val="22"/>
-              </w:rPr>
-              <w:t xml:space="preserve">Match 2</w:t>
-            </w:r>
-          </w:p>
-        </w:tc>
-      </w:tr>
-      <w:tr>
-        <w:trPr>
-          <w:cantSplit/>
-        </w:trPr>
-        <w:tc>
-          <w:tcPr>
-            <w:tcW w:w="1900" w:type="dxa"/>
-            <w:shd w:val="clear" w:color="auto" w:fill="F2F6F8"/>
-            <w:vAlign w:val="top"/>
-          </w:tcPr>
-          <w:p>
-            <w:pPr>
-              <w:keepNext/>
-              <w:keepLines/>
-              <w:spacing w:before="0" w:after="0"/>
-            </w:pPr>
-            <w:r>
-              <w:rPr>
-                <w:b/>
-                <w:color w:val="17324D"/>
-              </w:rPr>
-              <w:t xml:space="preserve">Item</w:t>
-            </w:r>
-          </w:p>
-        </w:tc>
-        <w:tc>
-          <w:tcPr>
-            <w:tcW w:w="7100" w:type="dxa"/>
-            <w:shd w:val="clear" w:color="auto" w:fill="FFFFFF"/>
-            <w:vAlign w:val="top"/>
-          </w:tcPr>
-          <w:p>
-            <w:pPr>
-              <w:keepNext/>
-              <w:keepLines/>
-              <w:spacing w:before="0" w:after="0"/>
-            </w:pPr>
-            <w:r>
-              <w:rPr>
-                <w:color w:val="203040"/>
-              </w:rPr>
-              <w:t xml:space="preserve">Zingiberis Rhizoma recens (sheng jiang)</w:t>
-            </w:r>
-          </w:p>
-        </w:tc>
-      </w:tr>
-      <w:tr>
-        <w:trPr>
-          <w:cantSplit/>
-        </w:trPr>
-        <w:tc>
-          <w:tcPr>
-            <w:tcW w:w="1900" w:type="dxa"/>
-            <w:shd w:val="clear" w:color="auto" w:fill="F2F6F8"/>
-            <w:vAlign w:val="top"/>
-          </w:tcPr>
-          <w:p>
-            <w:pPr>
-              <w:keepNext/>
-              <w:keepLines/>
-              <w:spacing w:before="0" w:after="0"/>
-            </w:pPr>
-            <w:r>
-              <w:rPr>
-                <w:b/>
-                <w:color w:val="17324D"/>
-              </w:rPr>
-              <w:t xml:space="preserve">Category</w:t>
-            </w:r>
-          </w:p>
-        </w:tc>
-        <w:tc>
-          <w:tcPr>
-            <w:tcW w:w="7100" w:type="dxa"/>
-            <w:shd w:val="clear" w:color="auto" w:fill="FFFFFF"/>
-            <w:vAlign w:val="top"/>
-          </w:tcPr>
-          <w:p>
-            <w:pPr>
-              <w:keepNext/>
-              <w:keepLines/>
-              <w:spacing w:before="0" w:after="0"/>
-            </w:pPr>
-            <w:r>
-              <w:rPr>
-                <w:color w:val="203040"/>
-              </w:rPr>
-              <w:t xml:space="preserve">Warm, Acrid Herbs that Release the Exterior.</w:t>
-            </w:r>
-          </w:p>
-        </w:tc>
-      </w:tr>
-      <w:tr>
-        <w:trPr>
-          <w:cantSplit/>
-        </w:trPr>
-        <w:tc>
-          <w:tcPr>
-            <w:tcW w:w="1900" w:type="dxa"/>
-            <w:shd w:val="clear" w:color="auto" w:fill="F2F6F8"/>
-            <w:vAlign w:val="top"/>
-          </w:tcPr>
-          <w:p>
-            <w:pPr>
-              <w:keepLines/>
-              <w:spacing w:before="0" w:after="0"/>
-            </w:pPr>
-            <w:r>
-              <w:rPr>
-                <w:b/>
-                <w:color w:val="17324D"/>
-              </w:rPr>
-              <w:t xml:space="preserve">Formulas (6)</w:t>
-            </w:r>
-          </w:p>
-        </w:tc>
-        <w:tc>
-          <w:tcPr>
-            <w:tcW w:w="7100" w:type="dxa"/>
+        <w:tc>
+          <w:tcPr>
+            <w:tcW w:w="3750" w:type="dxa"/>
             <w:shd w:val="clear" w:color="auto" w:fill="FFFFFF"/>
             <w:vAlign w:val="top"/>
           </w:tcPr>
@@ -996,7 +863,7 @@
         <w:rPr>
           <w:color w:val="245B38"/>
         </w:rPr>
-        <w:t xml:space="preserve">Match 1 — Alpiniae officinarum Rhizoma (gao liang jiang): classified as Herbs that Warm the Interior and Expel Cold; paired with the 2 formula associations shown in its Correct match card.</w:t>
+        <w:t xml:space="preserve">Match 1 — Alpiniae officinarum Rhizoma (gao liang jiang): classified as Herbs that Warm the Interior and Expel Cold; paired with the 2 formula associations shown in its comparison column.</w:t>
       </w:r>
       <w:r>
         <w:br/>
@@ -1005,7 +872,7 @@
         <w:rPr>
           <w:color w:val="245B38"/>
         </w:rPr>
-        <w:t xml:space="preserve">Match 2 — Zingiberis Rhizoma recens (sheng jiang): classified as Warm, Acrid Herbs that Release the Exterior; paired with the 6 formula associations shown in its Correct match card.</w:t>
+        <w:t xml:space="preserve">Match 2 — Zingiberis Rhizoma recens (sheng jiang): classified as Warm, Acrid Herbs that Release the Exterior; paired with the 6 formula associations shown in its comparison column.</w:t>
       </w:r>
     </w:p>
     <w:p>
@@ -1035,7 +902,7 @@
         <w:rPr>
           <w:color w:val="6B3030"/>
         </w:rPr>
-        <w:t xml:space="preserve">Keep each item with the classification and association group shown in its numbered card. Interchanging the groups for Alpiniae officinarum Rhizoma (gao liang jiang) and Zingiberis Rhizoma recens (sheng jiang) would attach the source associations to the wrong item and is evaluated as an incorrect match.</w:t>
+        <w:t xml:space="preserve">Keep each item with the classification and association group shown in its comparison table. Interchanging the groups for Alpiniae officinarum Rhizoma (gao liang jiang) and Zingiberis Rhizoma recens (sheng jiang) would attach the source associations to the wrong item and is evaluated as an incorrect match.</w:t>
       </w:r>
     </w:p>
     <w:p>

</xml_diff>

<commit_message>
Compare matching study tips side by side
</commit_message>
<xml_diff>
--- a/mod/scorm/studytopic/samples/Real_Herb_Comparison_Matching_Polished_Preview.docx
+++ b/mod/scorm/studytopic/samples/Real_Herb_Comparison_Matching_Polished_Preview.docx
@@ -214,14 +214,15 @@
         </w:tblBorders>
         <w:tblCellMar>
           <w:top w:w="100" w:type="dxa"/>
-          <w:left w:w="120" w:type="dxa"/>
+          <w:left w:w="110" w:type="dxa"/>
           <w:bottom w:w="100" w:type="dxa"/>
-          <w:right w:w="120" w:type="dxa"/>
+          <w:right w:w="110" w:type="dxa"/>
         </w:tblCellMar>
       </w:tblPr>
       <w:tblGrid>
-        <w:gridCol w:w="1900"/>
-        <w:gridCol w:w="7100"/>
+        <w:gridCol w:w="1500"/>
+        <w:gridCol w:w="3750"/>
+        <w:gridCol w:w="3750"/>
       </w:tblGrid>
       <w:tr>
         <w:trPr>
@@ -229,8 +230,10 @@
         </w:trPr>
         <w:tc>
           <w:tcPr>
-            <w:gridSpan w:val="2"/>
+            <w:gridSpan w:val="3"/>
+            <w:tcW w:w="9000" w:type="dxa"/>
             <w:shd w:val="clear" w:color="auto" w:fill="527286"/>
+            <w:vAlign w:val="top"/>
           </w:tcPr>
           <w:p>
             <w:pPr>
@@ -242,8 +245,6 @@
               <w:rPr>
                 <w:b/>
                 <w:color w:val="FFFFFF"/>
-                <w:sz w:val="22"/>
-                <w:szCs w:val="22"/>
               </w:rPr>
               <w:t xml:space="preserve">Study tip · Clues to help answer</w:t>
             </w:r>
@@ -256,8 +257,8 @@
         </w:trPr>
         <w:tc>
           <w:tcPr>
-            <w:tcW w:w="1900" w:type="dxa"/>
-            <w:shd w:val="clear" w:color="auto" w:fill="F2F6F8"/>
+            <w:tcW w:w="1500" w:type="dxa"/>
+            <w:shd w:val="clear" w:color="auto" w:fill="DDEAF0"/>
             <w:vAlign w:val="top"/>
           </w:tcPr>
           <w:p>
@@ -269,29 +270,51 @@
             <w:r>
               <w:rPr>
                 <w:b/>
-                <w:color w:val="17324D"/>
-              </w:rPr>
-              <w:t xml:space="preserve">Shared clues</w:t>
-            </w:r>
-          </w:p>
-        </w:tc>
-        <w:tc>
-          <w:tcPr>
-            <w:tcW w:w="7100" w:type="dxa"/>
-            <w:shd w:val="clear" w:color="auto" w:fill="FFFFFF"/>
-            <w:vAlign w:val="top"/>
-          </w:tcPr>
-          <w:p>
-            <w:pPr>
-              <w:keepNext/>
-              <w:keepLines/>
-              <w:spacing w:before="0" w:after="0"/>
-            </w:pPr>
-            <w:r>
-              <w:rPr>
-                <w:color w:val="203040"/>
-              </w:rPr>
-              <w:t xml:space="preserve">Both herbs warm the middle, disperse cold, and settle nausea.</w:t>
+                <w:color w:val="203040"/>
+              </w:rPr>
+              <w:t xml:space="preserve">Clue</w:t>
+            </w:r>
+          </w:p>
+        </w:tc>
+        <w:tc>
+          <w:tcPr>
+            <w:tcW w:w="3750" w:type="dxa"/>
+            <w:shd w:val="clear" w:color="auto" w:fill="DDEAF0"/>
+            <w:vAlign w:val="top"/>
+          </w:tcPr>
+          <w:p>
+            <w:pPr>
+              <w:keepNext/>
+              <w:keepLines/>
+              <w:spacing w:before="0" w:after="0"/>
+            </w:pPr>
+            <w:r>
+              <w:rPr>
+                <w:b/>
+                <w:color w:val="203040"/>
+              </w:rPr>
+              <w:t xml:space="preserve">Gao Liang jiang</w:t>
+            </w:r>
+          </w:p>
+        </w:tc>
+        <w:tc>
+          <w:tcPr>
+            <w:tcW w:w="3750" w:type="dxa"/>
+            <w:shd w:val="clear" w:color="auto" w:fill="DDEAF0"/>
+            <w:vAlign w:val="top"/>
+          </w:tcPr>
+          <w:p>
+            <w:pPr>
+              <w:keepNext/>
+              <w:keepLines/>
+              <w:spacing w:before="0" w:after="0"/>
+            </w:pPr>
+            <w:r>
+              <w:rPr>
+                <w:b/>
+                <w:color w:val="203040"/>
+              </w:rPr>
+              <w:t xml:space="preserve">Sheng Jiang</w:t>
             </w:r>
           </w:p>
         </w:tc>
@@ -302,7 +325,7 @@
         </w:trPr>
         <w:tc>
           <w:tcPr>
-            <w:tcW w:w="1900" w:type="dxa"/>
+            <w:tcW w:w="1500" w:type="dxa"/>
             <w:shd w:val="clear" w:color="auto" w:fill="F2F6F8"/>
             <w:vAlign w:val="top"/>
           </w:tcPr>
@@ -315,15 +338,16 @@
             <w:r>
               <w:rPr>
                 <w:b/>
-                <w:color w:val="17324D"/>
-              </w:rPr>
-              <w:t xml:space="preserve">Gao Liang jiang</w:t>
-            </w:r>
-          </w:p>
-        </w:tc>
-        <w:tc>
-          <w:tcPr>
-            <w:tcW w:w="7100" w:type="dxa"/>
+                <w:color w:val="203040"/>
+              </w:rPr>
+              <w:t xml:space="preserve">Shared clues</w:t>
+            </w:r>
+          </w:p>
+        </w:tc>
+        <w:tc>
+          <w:tcPr>
+            <w:gridSpan w:val="2"/>
+            <w:tcW w:w="7500" w:type="dxa"/>
             <w:shd w:val="clear" w:color="auto" w:fill="FFFFFF"/>
             <w:vAlign w:val="top"/>
           </w:tcPr>
@@ -337,43 +361,7 @@
               <w:rPr>
                 <w:color w:val="203040"/>
               </w:rPr>
-              <w:t xml:space="preserve">• Abdominal pain</w:t>
-            </w:r>
-            <w:r>
-              <w:br/>
-            </w:r>
-            <w:r>
-              <w:rPr>
-                <w:color w:val="203040"/>
-              </w:rPr>
-              <w:t xml:space="preserve">• Vomiting</w:t>
-            </w:r>
-            <w:r>
-              <w:br/>
-            </w:r>
-            <w:r>
-              <w:rPr>
-                <w:color w:val="203040"/>
-              </w:rPr>
-              <w:t xml:space="preserve">• Diarrhea</w:t>
-            </w:r>
-            <w:r>
-              <w:br/>
-            </w:r>
-            <w:r>
-              <w:rPr>
-                <w:color w:val="203040"/>
-              </w:rPr>
-              <w:t xml:space="preserve">• Acid reflux</w:t>
-            </w:r>
-            <w:r>
-              <w:br/>
-            </w:r>
-            <w:r>
-              <w:rPr>
-                <w:color w:val="203040"/>
-              </w:rPr>
-              <w:t xml:space="preserve">• Loss of appetite</w:t>
+              <w:t xml:space="preserve">Both herbs warm the middle, disperse cold, and settle nausea.</w:t>
             </w:r>
           </w:p>
         </w:tc>
@@ -384,7 +372,7 @@
         </w:trPr>
         <w:tc>
           <w:tcPr>
-            <w:tcW w:w="1900" w:type="dxa"/>
+            <w:tcW w:w="1500" w:type="dxa"/>
             <w:shd w:val="clear" w:color="auto" w:fill="F2F6F8"/>
             <w:vAlign w:val="top"/>
           </w:tcPr>
@@ -396,15 +384,70 @@
             <w:r>
               <w:rPr>
                 <w:b/>
-                <w:color w:val="17324D"/>
-              </w:rPr>
-              <w:t xml:space="preserve">Sheng Jiang</w:t>
-            </w:r>
-          </w:p>
-        </w:tc>
-        <w:tc>
-          <w:tcPr>
-            <w:tcW w:w="7100" w:type="dxa"/>
+                <w:color w:val="203040"/>
+              </w:rPr>
+              <w:t xml:space="preserve">Symptoms / conditions</w:t>
+            </w:r>
+          </w:p>
+        </w:tc>
+        <w:tc>
+          <w:tcPr>
+            <w:tcW w:w="3750" w:type="dxa"/>
+            <w:shd w:val="clear" w:color="auto" w:fill="FFFFFF"/>
+            <w:vAlign w:val="top"/>
+          </w:tcPr>
+          <w:p>
+            <w:pPr>
+              <w:keepLines/>
+              <w:spacing w:before="0" w:after="0"/>
+            </w:pPr>
+            <w:r>
+              <w:rPr>
+                <w:color w:val="203040"/>
+              </w:rPr>
+              <w:t xml:space="preserve">• Abdominal pain</w:t>
+            </w:r>
+            <w:r>
+              <w:br/>
+            </w:r>
+            <w:r>
+              <w:rPr>
+                <w:color w:val="203040"/>
+              </w:rPr>
+              <w:t xml:space="preserve">• Vomiting</w:t>
+            </w:r>
+            <w:r>
+              <w:br/>
+            </w:r>
+            <w:r>
+              <w:rPr>
+                <w:color w:val="203040"/>
+              </w:rPr>
+              <w:t xml:space="preserve">• Diarrhea</w:t>
+            </w:r>
+            <w:r>
+              <w:br/>
+            </w:r>
+            <w:r>
+              <w:rPr>
+                <w:color w:val="203040"/>
+              </w:rPr>
+              <w:t xml:space="preserve">• Acid reflux</w:t>
+            </w:r>
+            <w:r>
+              <w:br/>
+            </w:r>
+            <w:r>
+              <w:rPr>
+                <w:color w:val="203040"/>
+              </w:rPr>
+              <w:t xml:space="preserve">• Loss of appetite</w:t>
+            </w:r>
+          </w:p>
+        </w:tc>
+        <w:tc>
+          <w:tcPr>
+            <w:tcW w:w="3750" w:type="dxa"/>
             <w:shd w:val="clear" w:color="auto" w:fill="FFFFFF"/>
             <w:vAlign w:val="top"/>
           </w:tcPr>

</xml_diff>

<commit_message>
Highlight shared matching clues
</commit_message>
<xml_diff>
--- a/mod/scorm/studytopic/samples/Real_Herb_Comparison_Matching_Polished_Preview.docx
+++ b/mod/scorm/studytopic/samples/Real_Herb_Comparison_Matching_Polished_Preview.docx
@@ -326,19 +326,19 @@
         <w:tc>
           <w:tcPr>
             <w:tcW w:w="1500" w:type="dxa"/>
-            <w:shd w:val="clear" w:color="auto" w:fill="F2F6F8"/>
-            <w:vAlign w:val="top"/>
-          </w:tcPr>
-          <w:p>
-            <w:pPr>
-              <w:keepNext/>
-              <w:keepLines/>
-              <w:spacing w:before="0" w:after="0"/>
-            </w:pPr>
-            <w:r>
-              <w:rPr>
-                <w:b/>
-                <w:color w:val="203040"/>
+            <w:shd w:val="clear" w:color="auto" w:fill="FFE4B8"/>
+            <w:vAlign w:val="top"/>
+          </w:tcPr>
+          <w:p>
+            <w:pPr>
+              <w:keepNext/>
+              <w:keepLines/>
+              <w:spacing w:before="0" w:after="0"/>
+            </w:pPr>
+            <w:r>
+              <w:rPr>
+                <w:b/>
+                <w:color w:val="8A3F0A"/>
               </w:rPr>
               <w:t xml:space="preserve">Shared clues</w:t>
             </w:r>
@@ -348,18 +348,19 @@
           <w:tcPr>
             <w:gridSpan w:val="2"/>
             <w:tcW w:w="7500" w:type="dxa"/>
-            <w:shd w:val="clear" w:color="auto" w:fill="FFFFFF"/>
-            <w:vAlign w:val="top"/>
-          </w:tcPr>
-          <w:p>
-            <w:pPr>
-              <w:keepNext/>
-              <w:keepLines/>
-              <w:spacing w:before="0" w:after="0"/>
-            </w:pPr>
-            <w:r>
-              <w:rPr>
-                <w:color w:val="203040"/>
+            <w:shd w:val="clear" w:color="auto" w:fill="FFF6E8"/>
+            <w:vAlign w:val="top"/>
+          </w:tcPr>
+          <w:p>
+            <w:pPr>
+              <w:keepNext/>
+              <w:keepLines/>
+              <w:spacing w:before="0" w:after="0"/>
+            </w:pPr>
+            <w:r>
+              <w:rPr>
+                <w:b/>
+                <w:color w:val="8A3F0A"/>
               </w:rPr>
               <w:t xml:space="preserve">Both herbs warm the middle, disperse cold, and settle nausea.</w:t>
             </w:r>
@@ -384,7 +385,7 @@
             <w:r>
               <w:rPr>
                 <w:b/>
-                <w:color w:val="203040"/>
+                <w:color w:val="17324D"/>
               </w:rPr>
               <w:t xml:space="preserve">Symptoms / conditions</w:t>
             </w:r>
@@ -697,7 +698,7 @@
             <w:r>
               <w:rPr>
                 <w:b/>
-                <w:color w:val="203040"/>
+                <w:color w:val="17324D"/>
               </w:rPr>
               <w:t xml:space="preserve">Category</w:t>
             </w:r>
@@ -762,7 +763,7 @@
             <w:r>
               <w:rPr>
                 <w:b/>
-                <w:color w:val="203040"/>
+                <w:color w:val="17324D"/>
               </w:rPr>
               <w:t xml:space="preserve">Formulas</w:t>
             </w:r>

</xml_diff>

<commit_message>
Add exam strategy coaching to matching reviews
</commit_message>
<xml_diff>
--- a/mod/scorm/studytopic/samples/Real_Herb_Comparison_Matching_Polished_Preview.docx
+++ b/mod/scorm/studytopic/samples/Real_Herb_Comparison_Matching_Polished_Preview.docx
@@ -534,6 +534,274 @@
                 <w:color w:val="203040"/>
               </w:rPr>
               <w:t xml:space="preserve">• Drug poisoning</w:t>
+            </w:r>
+          </w:p>
+        </w:tc>
+      </w:tr>
+    </w:tbl>
+    <w:p>
+      <w:pPr>
+        <w:spacing w:before="0" w:after="120"/>
+      </w:pPr>
+      <w:r>
+        <w:t xml:space="preserve"/>
+      </w:r>
+    </w:p>
+    <w:tbl>
+      <w:tblPr>
+        <w:tblW w:w="9000" w:type="dxa"/>
+        <w:tblLayout w:type="fixed"/>
+        <w:tblBorders>
+          <w:top w:val="single" w:sz="8" w:color="D6E1E7"/>
+          <w:left w:val="single" w:sz="8" w:color="D6E1E7"/>
+          <w:bottom w:val="single" w:sz="8" w:color="D6E1E7"/>
+          <w:right w:val="single" w:sz="8" w:color="D6E1E7"/>
+          <w:insideH w:val="single" w:sz="6" w:color="D6E1E7"/>
+          <w:insideV w:val="single" w:sz="6" w:color="D6E1E7"/>
+        </w:tblBorders>
+        <w:tblCellMar>
+          <w:top w:w="100" w:type="dxa"/>
+          <w:left w:w="120" w:type="dxa"/>
+          <w:bottom w:w="100" w:type="dxa"/>
+          <w:right w:w="120" w:type="dxa"/>
+        </w:tblCellMar>
+      </w:tblPr>
+      <w:tblGrid>
+        <w:gridCol w:w="1900"/>
+        <w:gridCol w:w="7100"/>
+      </w:tblGrid>
+      <w:tr>
+        <w:trPr>
+          <w:cantSplit/>
+        </w:trPr>
+        <w:tc>
+          <w:tcPr>
+            <w:gridSpan w:val="2"/>
+            <w:shd w:val="clear" w:color="auto" w:fill="6B4BA1"/>
+          </w:tcPr>
+          <w:p>
+            <w:pPr>
+              <w:keepNext/>
+              <w:keepLines/>
+              <w:spacing w:before="0" w:after="0"/>
+            </w:pPr>
+            <w:r>
+              <w:rPr>
+                <w:b/>
+                <w:color w:val="FFFFFF"/>
+                <w:sz w:val="22"/>
+                <w:szCs w:val="22"/>
+              </w:rPr>
+              <w:t xml:space="preserve">Exam strategy · Why this distinction matters</w:t>
+            </w:r>
+          </w:p>
+        </w:tc>
+      </w:tr>
+      <w:tr>
+        <w:trPr>
+          <w:cantSplit/>
+        </w:trPr>
+        <w:tc>
+          <w:tcPr>
+            <w:tcW w:w="1900" w:type="dxa"/>
+            <w:shd w:val="clear" w:color="auto" w:fill="F2F6F8"/>
+            <w:vAlign w:val="top"/>
+          </w:tcPr>
+          <w:p>
+            <w:pPr>
+              <w:keepNext/>
+              <w:keepLines/>
+              <w:spacing w:before="0" w:after="0"/>
+            </w:pPr>
+            <w:r>
+              <w:rPr>
+                <w:b/>
+                <w:color w:val="17324D"/>
+              </w:rPr>
+              <w:t xml:space="preserve">Why it matters</w:t>
+            </w:r>
+          </w:p>
+        </w:tc>
+        <w:tc>
+          <w:tcPr>
+            <w:tcW w:w="7100" w:type="dxa"/>
+            <w:shd w:val="clear" w:color="auto" w:fill="FFFFFF"/>
+            <w:vAlign w:val="top"/>
+          </w:tcPr>
+          <w:p>
+            <w:pPr>
+              <w:keepNext/>
+              <w:keepLines/>
+              <w:spacing w:before="0" w:after="0"/>
+            </w:pPr>
+            <w:r>
+              <w:rPr>
+                <w:color w:val="203040"/>
+              </w:rPr>
+              <w:t xml:space="preserve">Both herbs warm the middle, disperse cold, and settle nausea. The distinction matters because Gao Liang jiang is classified as Herbs that Warm the Interior and Expel Cold, while Sheng Jiang is classified as Warm, Acrid Herbs that Release the Exterior. The exam may test whether you move beyond the shared action and identify the correct clinical context.</w:t>
+            </w:r>
+          </w:p>
+        </w:tc>
+      </w:tr>
+      <w:tr>
+        <w:trPr>
+          <w:cantSplit/>
+        </w:trPr>
+        <w:tc>
+          <w:tcPr>
+            <w:tcW w:w="1900" w:type="dxa"/>
+            <w:shd w:val="clear" w:color="auto" w:fill="F2F6F8"/>
+            <w:vAlign w:val="top"/>
+          </w:tcPr>
+          <w:p>
+            <w:pPr>
+              <w:keepNext/>
+              <w:keepLines/>
+              <w:spacing w:before="0" w:after="0"/>
+            </w:pPr>
+            <w:r>
+              <w:rPr>
+                <w:b/>
+                <w:color w:val="17324D"/>
+              </w:rPr>
+              <w:t xml:space="preserve">Common confusion</w:t>
+            </w:r>
+          </w:p>
+        </w:tc>
+        <w:tc>
+          <w:tcPr>
+            <w:tcW w:w="7100" w:type="dxa"/>
+            <w:shd w:val="clear" w:color="auto" w:fill="FFFFFF"/>
+            <w:vAlign w:val="top"/>
+          </w:tcPr>
+          <w:p>
+            <w:pPr>
+              <w:keepNext/>
+              <w:keepLines/>
+              <w:spacing w:before="0" w:after="0"/>
+            </w:pPr>
+            <w:r>
+              <w:rPr>
+                <w:color w:val="203040"/>
+              </w:rPr>
+              <w:t xml:space="preserve">Vomiting, Loss of appetite appear in both clue sets, so those findings alone do not separate the herbs. Look for Abdominal pain, Diarrhea, Acid reflux to favor Gao Liang jiang, versus Common cold, Nasal congestion, Coughing to favor Sheng Jiang.</w:t>
+            </w:r>
+          </w:p>
+        </w:tc>
+      </w:tr>
+      <w:tr>
+        <w:trPr>
+          <w:cantSplit/>
+        </w:trPr>
+        <w:tc>
+          <w:tcPr>
+            <w:tcW w:w="1900" w:type="dxa"/>
+            <w:shd w:val="clear" w:color="auto" w:fill="F2F6F8"/>
+            <w:vAlign w:val="top"/>
+          </w:tcPr>
+          <w:p>
+            <w:pPr>
+              <w:keepNext/>
+              <w:keepLines/>
+              <w:spacing w:before="0" w:after="0"/>
+            </w:pPr>
+            <w:r>
+              <w:rPr>
+                <w:b/>
+                <w:color w:val="17324D"/>
+              </w:rPr>
+              <w:t xml:space="preserve">How it may appear</w:t>
+            </w:r>
+          </w:p>
+        </w:tc>
+        <w:tc>
+          <w:tcPr>
+            <w:tcW w:w="7100" w:type="dxa"/>
+            <w:shd w:val="clear" w:color="auto" w:fill="FFFFFF"/>
+            <w:vAlign w:val="top"/>
+          </w:tcPr>
+          <w:p>
+            <w:pPr>
+              <w:keepNext/>
+              <w:keepLines/>
+              <w:spacing w:before="0" w:after="0"/>
+            </w:pPr>
+            <w:r>
+              <w:rPr>
+                <w:color w:val="203040"/>
+              </w:rPr>
+              <w:t xml:space="preserve">A vignette emphasizing Abdominal pain, Diarrhea, Acid reflux could ask for the better match: Gao Liang jiang. A second vignette emphasizing Common cold, Nasal congestion, Coughing could point to Sheng Jiang. The same distinction may also appear as a category or formula-association question.</w:t>
+            </w:r>
+          </w:p>
+        </w:tc>
+      </w:tr>
+      <w:tr>
+        <w:trPr>
+          <w:cantSplit/>
+        </w:trPr>
+        <w:tc>
+          <w:tcPr>
+            <w:tcW w:w="1900" w:type="dxa"/>
+            <w:shd w:val="clear" w:color="auto" w:fill="F2F6F8"/>
+            <w:vAlign w:val="top"/>
+          </w:tcPr>
+          <w:p>
+            <w:pPr>
+              <w:keepLines/>
+              <w:spacing w:before="0" w:after="0"/>
+            </w:pPr>
+            <w:r>
+              <w:rPr>
+                <w:b/>
+                <w:color w:val="17324D"/>
+              </w:rPr>
+              <w:t xml:space="preserve">Related questions</w:t>
+            </w:r>
+          </w:p>
+        </w:tc>
+        <w:tc>
+          <w:tcPr>
+            <w:tcW w:w="7100" w:type="dxa"/>
+            <w:shd w:val="clear" w:color="auto" w:fill="FFFFFF"/>
+            <w:vAlign w:val="top"/>
+          </w:tcPr>
+          <w:p>
+            <w:pPr>
+              <w:keepLines/>
+              <w:spacing w:before="0" w:after="0"/>
+            </w:pPr>
+            <w:r>
+              <w:rPr>
+                <w:color w:val="203040"/>
+              </w:rPr>
+              <w:t xml:space="preserve">• Which category belongs to Gao Liang jiang and which belongs to Sheng Jiang?</w:t>
+            </w:r>
+            <w:r>
+              <w:br/>
+            </w:r>
+            <w:r>
+              <w:rPr>
+                <w:color w:val="203040"/>
+              </w:rPr>
+              <w:t xml:space="preserve">• Which findings are shared and therefore least useful for distinguishing them?</w:t>
+            </w:r>
+            <w:r>
+              <w:br/>
+            </w:r>
+            <w:r>
+              <w:rPr>
+                <w:color w:val="203040"/>
+              </w:rPr>
+              <w:t xml:space="preserve">• Which symptom cluster most strongly favors each item?</w:t>
+            </w:r>
+            <w:r>
+              <w:br/>
+            </w:r>
+            <w:r>
+              <w:rPr>
+                <w:color w:val="203040"/>
+              </w:rPr>
+              <w:t xml:space="preserve">• Which formula associations belong in each comparison column?</w:t>
             </w:r>
           </w:p>
         </w:tc>

</xml_diff>

<commit_message>
Add category-first matching study guide index
</commit_message>
<xml_diff>
--- a/mod/scorm/studytopic/samples/Real_Herb_Comparison_Matching_Polished_Preview.docx
+++ b/mod/scorm/studytopic/samples/Real_Herb_Comparison_Matching_Polished_Preview.docx
@@ -4,53 +4,31 @@
   <w:body>
     <w:p>
       <w:pPr>
-        <w:spacing w:before="0" w:after="420"/>
+        <w:pStyle w:val="Title"/>
+        <w:spacing w:before="0" w:after="120"/>
       </w:pPr>
       <w:r>
-        <w:t xml:space="preserve"/>
+        <w:t xml:space="preserve">Matching Study Guide Index</w:t>
       </w:r>
     </w:p>
     <w:p>
       <w:pPr>
-        <w:pStyle w:val="BookBrand"/>
-        <w:spacing w:before="0" w:after="260"/>
-        <w:jc w:val="center"/>
-      </w:pPr>
-      <w:r>
-        <w:t xml:space="preserve">ACUPUNCTURETESTS</w:t>
-      </w:r>
-    </w:p>
-    <w:p>
-      <w:pPr>
-        <w:pStyle w:val="Title"/>
-        <w:keepLines/>
-        <w:spacing w:before="180" w:after="220"/>
-        <w:jc w:val="center"/>
-      </w:pPr>
-      <w:r>
-        <w:t xml:space="preserve">Herb Comparison — Matching Review</w:t>
-      </w:r>
-    </w:p>
-    <w:p>
-      <w:pPr>
-        <w:pStyle w:val="BookSubtitle"/>
-        <w:spacing w:before="0" w:after="420"/>
-        <w:jc w:val="center"/>
+        <w:spacing w:before="0" w:after="180"/>
       </w:pPr>
       <w:r>
         <w:rPr>
           <w:color w:val="527286"/>
-          <w:sz w:val="26"/>
-          <w:szCs w:val="26"/>
+          <w:sz w:val="22"/>
+          <w:szCs w:val="22"/>
         </w:rPr>
-        <w:t xml:space="preserve">Exam Review Book · Instructor Edition</w:t>
+        <w:t xml:space="preserve">1 Matching question · 1 category</w:t>
       </w:r>
     </w:p>
     <w:p>
       <w:pPr>
         <w:keepLines/>
-        <w:spacing w:before="120" w:after="220"/>
-        <w:ind w:left="720" w:right="720"/>
+        <w:spacing w:before="0" w:after="180"/>
+        <w:ind w:left="180" w:right="120"/>
         <w:shd w:val="clear" w:color="auto" w:fill="E8F3F5"/>
         <w:pBdr>
           <w:left w:val="single" w:sz="20" w:space="8" w:color="F47E2C"/>
@@ -58,82 +36,31 @@
       </w:pPr>
       <w:r>
         <w:rPr>
+          <w:i/>
           <w:color w:val="31586B"/>
         </w:rPr>
-        <w:t xml:space="preserve">Course: Herb Exams</w:t>
-      </w:r>
-      <w:r>
-        <w:br/>
-      </w:r>
+        <w:t xml:space="preserve">Comparisons are grouped and sorted by the category of the first herb.</w:t>
+      </w:r>
+    </w:p>
+    <w:p>
+      <w:pPr>
+        <w:pStyle w:val="Heading2"/>
+        <w:keepNext/>
+        <w:spacing w:before="120" w:after="70"/>
+      </w:pPr>
       <w:r>
         <w:rPr>
-          <w:color w:val="31586B"/>
+          <w:color w:val="17324D"/>
         </w:rPr>
-        <w:t xml:space="preserve">Section: Comparative Functions</w:t>
-      </w:r>
-      <w:r>
-        <w:br/>
-      </w:r>
-      <w:r>
-        <w:rPr>
-          <w:color w:val="31586B"/>
-        </w:rPr>
-        <w:t xml:space="preserve">Questions: 1</w:t>
-      </w:r>
-      <w:r>
-        <w:br/>
-      </w:r>
-      <w:r>
-        <w:rPr>
-          <w:color w:val="31586B"/>
-        </w:rPr>
-        <w:t xml:space="preserve">Source CMID: sample</w:t>
-      </w:r>
-    </w:p>
-    <w:p>
-      <w:pPr>
-        <w:spacing w:before="0" w:after="240"/>
-        <w:jc w:val="center"/>
-      </w:pPr>
-      <w:r>
-        <w:rPr>
-          <w:i/>
-          <w:color w:val="8A3F0A"/>
-        </w:rPr>
-        <w:t xml:space="preserve">Answer key and source feedback are included for instructor review.</w:t>
-      </w:r>
-    </w:p>
-    <w:p>
-      <w:r>
-        <w:br w:type="page"/>
-      </w:r>
-    </w:p>
-    <w:p>
-      <w:pPr>
-        <w:pStyle w:val="Heading1"/>
-        <w:spacing w:before="0" w:after="180"/>
-      </w:pPr>
-      <w:r>
-        <w:t xml:space="preserve">Contents</w:t>
-      </w:r>
-    </w:p>
-    <w:p>
-      <w:pPr>
-        <w:spacing w:before="0" w:after="180"/>
-      </w:pPr>
-      <w:r>
-        <w:rPr>
-          <w:color w:val="527286"/>
-        </w:rPr>
-        <w:t xml:space="preserve">This study book is arranged in groups of up to ten questions for easier reading and review.</w:t>
+        <w:t xml:space="preserve">Herbs that Warm the Interior and Expel Cold (1)</w:t>
       </w:r>
     </w:p>
     <w:p>
       <w:pPr>
         <w:keepLines/>
-        <w:spacing w:before="0" w:after="80"/>
+        <w:spacing w:before="0" w:after="70"/>
         <w:ind w:left="180" w:right="120"/>
-        <w:shd w:val="clear" w:color="auto" w:fill="F7F9FB"/>
+        <w:shd w:val="clear" w:color="auto" w:fill="FFF6E8"/>
         <w:pBdr>
           <w:left w:val="single" w:sz="20" w:space="8" w:color="F47E2C"/>
         </w:pBdr>
@@ -141,9 +68,9 @@
       <w:r>
         <w:rPr>
           <w:b/>
-          <w:color w:val="17324D"/>
+          <w:color w:val="8A3F0A"/>
         </w:rPr>
-        <w:t xml:space="preserve">Chapter 1  ·  Questions 1–1</w:t>
+        <w:t xml:space="preserve">(gao liang jiang) vs. (sheng jiang)</w:t>
       </w:r>
     </w:p>
     <w:p>
@@ -154,49 +81,10 @@
     <w:p>
       <w:pPr>
         <w:pStyle w:val="Heading1"/>
-        <w:spacing w:before="0" w:after="220"/>
-      </w:pPr>
-      <w:r>
-        <w:t xml:space="preserve">Chapter 1 · Questions 1–1</w:t>
-      </w:r>
-    </w:p>
-    <w:p>
-      <w:pPr>
-        <w:pStyle w:val="Heading2"/>
-        <w:spacing w:before="0" w:after="70"/>
-      </w:pPr>
-      <w:r>
-        <w:t xml:space="preserve">Question 1</w:t>
-      </w:r>
-    </w:p>
-    <w:p>
-      <w:pPr>
-        <w:keepNext/>
-        <w:spacing w:before="0" w:after="70"/>
-        <w:ind w:left="180" w:right="0"/>
-      </w:pPr>
-      <w:r>
-        <w:rPr>
-          <w:i/>
-          <w:color w:val="527286"/>
-          <w:sz w:val="18"/>
-          <w:szCs w:val="18"/>
-        </w:rPr>
-        <w:t xml:space="preserve">Matching</w:t>
-      </w:r>
-    </w:p>
-    <w:p>
-      <w:pPr>
         <w:keepLines/>
         <w:spacing w:before="0" w:after="120"/>
-        <w:ind w:left="180" w:right="120"/>
       </w:pPr>
       <w:r>
-        <w:rPr>
-          <w:b/>
-          <w:sz w:val="22"/>
-          <w:szCs w:val="22"/>
-        </w:rPr>
         <w:t xml:space="preserve">Comparison Alpiniae officinarum Rhizoma (gao liang jiang) Vs. Zingiberis Rhizoma recens (sheng jiang)</w:t>
       </w:r>
     </w:p>
@@ -547,274 +435,6 @@
         <w:t xml:space="preserve"/>
       </w:r>
     </w:p>
-    <w:tbl>
-      <w:tblPr>
-        <w:tblW w:w="9000" w:type="dxa"/>
-        <w:tblLayout w:type="fixed"/>
-        <w:tblBorders>
-          <w:top w:val="single" w:sz="8" w:color="D6E1E7"/>
-          <w:left w:val="single" w:sz="8" w:color="D6E1E7"/>
-          <w:bottom w:val="single" w:sz="8" w:color="D6E1E7"/>
-          <w:right w:val="single" w:sz="8" w:color="D6E1E7"/>
-          <w:insideH w:val="single" w:sz="6" w:color="D6E1E7"/>
-          <w:insideV w:val="single" w:sz="6" w:color="D6E1E7"/>
-        </w:tblBorders>
-        <w:tblCellMar>
-          <w:top w:w="100" w:type="dxa"/>
-          <w:left w:w="120" w:type="dxa"/>
-          <w:bottom w:w="100" w:type="dxa"/>
-          <w:right w:w="120" w:type="dxa"/>
-        </w:tblCellMar>
-      </w:tblPr>
-      <w:tblGrid>
-        <w:gridCol w:w="1900"/>
-        <w:gridCol w:w="7100"/>
-      </w:tblGrid>
-      <w:tr>
-        <w:trPr>
-          <w:cantSplit/>
-        </w:trPr>
-        <w:tc>
-          <w:tcPr>
-            <w:gridSpan w:val="2"/>
-            <w:shd w:val="clear" w:color="auto" w:fill="6B4BA1"/>
-          </w:tcPr>
-          <w:p>
-            <w:pPr>
-              <w:keepNext/>
-              <w:keepLines/>
-              <w:spacing w:before="0" w:after="0"/>
-            </w:pPr>
-            <w:r>
-              <w:rPr>
-                <w:b/>
-                <w:color w:val="FFFFFF"/>
-                <w:sz w:val="22"/>
-                <w:szCs w:val="22"/>
-              </w:rPr>
-              <w:t xml:space="preserve">Exam strategy · Why this distinction matters</w:t>
-            </w:r>
-          </w:p>
-        </w:tc>
-      </w:tr>
-      <w:tr>
-        <w:trPr>
-          <w:cantSplit/>
-        </w:trPr>
-        <w:tc>
-          <w:tcPr>
-            <w:tcW w:w="1900" w:type="dxa"/>
-            <w:shd w:val="clear" w:color="auto" w:fill="F2F6F8"/>
-            <w:vAlign w:val="top"/>
-          </w:tcPr>
-          <w:p>
-            <w:pPr>
-              <w:keepNext/>
-              <w:keepLines/>
-              <w:spacing w:before="0" w:after="0"/>
-            </w:pPr>
-            <w:r>
-              <w:rPr>
-                <w:b/>
-                <w:color w:val="17324D"/>
-              </w:rPr>
-              <w:t xml:space="preserve">Why it matters</w:t>
-            </w:r>
-          </w:p>
-        </w:tc>
-        <w:tc>
-          <w:tcPr>
-            <w:tcW w:w="7100" w:type="dxa"/>
-            <w:shd w:val="clear" w:color="auto" w:fill="FFFFFF"/>
-            <w:vAlign w:val="top"/>
-          </w:tcPr>
-          <w:p>
-            <w:pPr>
-              <w:keepNext/>
-              <w:keepLines/>
-              <w:spacing w:before="0" w:after="0"/>
-            </w:pPr>
-            <w:r>
-              <w:rPr>
-                <w:color w:val="203040"/>
-              </w:rPr>
-              <w:t xml:space="preserve">Both herbs warm the middle, disperse cold, and settle nausea. The distinction matters because Gao Liang jiang is classified as Herbs that Warm the Interior and Expel Cold, while Sheng Jiang is classified as Warm, Acrid Herbs that Release the Exterior. The exam may test whether you move beyond the shared action and identify the correct clinical context.</w:t>
-            </w:r>
-          </w:p>
-        </w:tc>
-      </w:tr>
-      <w:tr>
-        <w:trPr>
-          <w:cantSplit/>
-        </w:trPr>
-        <w:tc>
-          <w:tcPr>
-            <w:tcW w:w="1900" w:type="dxa"/>
-            <w:shd w:val="clear" w:color="auto" w:fill="F2F6F8"/>
-            <w:vAlign w:val="top"/>
-          </w:tcPr>
-          <w:p>
-            <w:pPr>
-              <w:keepNext/>
-              <w:keepLines/>
-              <w:spacing w:before="0" w:after="0"/>
-            </w:pPr>
-            <w:r>
-              <w:rPr>
-                <w:b/>
-                <w:color w:val="17324D"/>
-              </w:rPr>
-              <w:t xml:space="preserve">Common confusion</w:t>
-            </w:r>
-          </w:p>
-        </w:tc>
-        <w:tc>
-          <w:tcPr>
-            <w:tcW w:w="7100" w:type="dxa"/>
-            <w:shd w:val="clear" w:color="auto" w:fill="FFFFFF"/>
-            <w:vAlign w:val="top"/>
-          </w:tcPr>
-          <w:p>
-            <w:pPr>
-              <w:keepNext/>
-              <w:keepLines/>
-              <w:spacing w:before="0" w:after="0"/>
-            </w:pPr>
-            <w:r>
-              <w:rPr>
-                <w:color w:val="203040"/>
-              </w:rPr>
-              <w:t xml:space="preserve">Vomiting, Loss of appetite appear in both clue sets, so those findings alone do not separate the herbs. Look for Abdominal pain, Diarrhea, Acid reflux to favor Gao Liang jiang, versus Common cold, Nasal congestion, Coughing to favor Sheng Jiang.</w:t>
-            </w:r>
-          </w:p>
-        </w:tc>
-      </w:tr>
-      <w:tr>
-        <w:trPr>
-          <w:cantSplit/>
-        </w:trPr>
-        <w:tc>
-          <w:tcPr>
-            <w:tcW w:w="1900" w:type="dxa"/>
-            <w:shd w:val="clear" w:color="auto" w:fill="F2F6F8"/>
-            <w:vAlign w:val="top"/>
-          </w:tcPr>
-          <w:p>
-            <w:pPr>
-              <w:keepNext/>
-              <w:keepLines/>
-              <w:spacing w:before="0" w:after="0"/>
-            </w:pPr>
-            <w:r>
-              <w:rPr>
-                <w:b/>
-                <w:color w:val="17324D"/>
-              </w:rPr>
-              <w:t xml:space="preserve">How it may appear</w:t>
-            </w:r>
-          </w:p>
-        </w:tc>
-        <w:tc>
-          <w:tcPr>
-            <w:tcW w:w="7100" w:type="dxa"/>
-            <w:shd w:val="clear" w:color="auto" w:fill="FFFFFF"/>
-            <w:vAlign w:val="top"/>
-          </w:tcPr>
-          <w:p>
-            <w:pPr>
-              <w:keepNext/>
-              <w:keepLines/>
-              <w:spacing w:before="0" w:after="0"/>
-            </w:pPr>
-            <w:r>
-              <w:rPr>
-                <w:color w:val="203040"/>
-              </w:rPr>
-              <w:t xml:space="preserve">A vignette emphasizing Abdominal pain, Diarrhea, Acid reflux could ask for the better match: Gao Liang jiang. A second vignette emphasizing Common cold, Nasal congestion, Coughing could point to Sheng Jiang. The same distinction may also appear as a category or formula-association question.</w:t>
-            </w:r>
-          </w:p>
-        </w:tc>
-      </w:tr>
-      <w:tr>
-        <w:trPr>
-          <w:cantSplit/>
-        </w:trPr>
-        <w:tc>
-          <w:tcPr>
-            <w:tcW w:w="1900" w:type="dxa"/>
-            <w:shd w:val="clear" w:color="auto" w:fill="F2F6F8"/>
-            <w:vAlign w:val="top"/>
-          </w:tcPr>
-          <w:p>
-            <w:pPr>
-              <w:keepLines/>
-              <w:spacing w:before="0" w:after="0"/>
-            </w:pPr>
-            <w:r>
-              <w:rPr>
-                <w:b/>
-                <w:color w:val="17324D"/>
-              </w:rPr>
-              <w:t xml:space="preserve">Related questions</w:t>
-            </w:r>
-          </w:p>
-        </w:tc>
-        <w:tc>
-          <w:tcPr>
-            <w:tcW w:w="7100" w:type="dxa"/>
-            <w:shd w:val="clear" w:color="auto" w:fill="FFFFFF"/>
-            <w:vAlign w:val="top"/>
-          </w:tcPr>
-          <w:p>
-            <w:pPr>
-              <w:keepLines/>
-              <w:spacing w:before="0" w:after="0"/>
-            </w:pPr>
-            <w:r>
-              <w:rPr>
-                <w:color w:val="203040"/>
-              </w:rPr>
-              <w:t xml:space="preserve">• Which category belongs to Gao Liang jiang and which belongs to Sheng Jiang?</w:t>
-            </w:r>
-            <w:r>
-              <w:br/>
-            </w:r>
-            <w:r>
-              <w:rPr>
-                <w:color w:val="203040"/>
-              </w:rPr>
-              <w:t xml:space="preserve">• Which findings are shared and therefore least useful for distinguishing them?</w:t>
-            </w:r>
-            <w:r>
-              <w:br/>
-            </w:r>
-            <w:r>
-              <w:rPr>
-                <w:color w:val="203040"/>
-              </w:rPr>
-              <w:t xml:space="preserve">• Which symptom cluster most strongly favors each item?</w:t>
-            </w:r>
-            <w:r>
-              <w:br/>
-            </w:r>
-            <w:r>
-              <w:rPr>
-                <w:color w:val="203040"/>
-              </w:rPr>
-              <w:t xml:space="preserve">• Which formula associations belong in each comparison column?</w:t>
-            </w:r>
-          </w:p>
-        </w:tc>
-      </w:tr>
-    </w:tbl>
-    <w:p>
-      <w:pPr>
-        <w:spacing w:before="0" w:after="120"/>
-      </w:pPr>
-      <w:r>
-        <w:t xml:space="preserve"/>
-      </w:r>
-    </w:p>
     <w:p>
       <w:pPr>
         <w:keepNext/>
@@ -1140,81 +760,249 @@
       </w:r>
     </w:p>
     <w:p>
+      <w:r>
+        <w:br w:type="page"/>
+      </w:r>
+    </w:p>
+    <w:tbl>
+      <w:tblPr>
+        <w:tblW w:w="9000" w:type="dxa"/>
+        <w:tblLayout w:type="fixed"/>
+        <w:tblBorders>
+          <w:top w:val="single" w:sz="8" w:color="D6E1E7"/>
+          <w:left w:val="single" w:sz="8" w:color="D6E1E7"/>
+          <w:bottom w:val="single" w:sz="8" w:color="D6E1E7"/>
+          <w:right w:val="single" w:sz="8" w:color="D6E1E7"/>
+          <w:insideH w:val="single" w:sz="6" w:color="D6E1E7"/>
+          <w:insideV w:val="single" w:sz="6" w:color="D6E1E7"/>
+        </w:tblBorders>
+        <w:tblCellMar>
+          <w:top w:w="100" w:type="dxa"/>
+          <w:left w:w="120" w:type="dxa"/>
+          <w:bottom w:w="100" w:type="dxa"/>
+          <w:right w:w="120" w:type="dxa"/>
+        </w:tblCellMar>
+      </w:tblPr>
+      <w:tblGrid>
+        <w:gridCol w:w="1900"/>
+        <w:gridCol w:w="7100"/>
+      </w:tblGrid>
+      <w:tr>
+        <w:trPr>
+          <w:cantSplit/>
+        </w:trPr>
+        <w:tc>
+          <w:tcPr>
+            <w:gridSpan w:val="2"/>
+            <w:shd w:val="clear" w:color="auto" w:fill="6B4BA1"/>
+          </w:tcPr>
+          <w:p>
+            <w:pPr>
+              <w:keepNext/>
+              <w:keepLines/>
+              <w:spacing w:before="0" w:after="0"/>
+            </w:pPr>
+            <w:r>
+              <w:rPr>
+                <w:b/>
+                <w:color w:val="FFFFFF"/>
+                <w:sz w:val="22"/>
+                <w:szCs w:val="22"/>
+              </w:rPr>
+              <w:t xml:space="preserve">Study guide · Exam focus</w:t>
+            </w:r>
+          </w:p>
+        </w:tc>
+      </w:tr>
+      <w:tr>
+        <w:trPr>
+          <w:cantSplit/>
+        </w:trPr>
+        <w:tc>
+          <w:tcPr>
+            <w:tcW w:w="1900" w:type="dxa"/>
+            <w:shd w:val="clear" w:color="auto" w:fill="F2F6F8"/>
+            <w:vAlign w:val="top"/>
+          </w:tcPr>
+          <w:p>
+            <w:pPr>
+              <w:keepNext/>
+              <w:keepLines/>
+              <w:spacing w:before="0" w:after="0"/>
+            </w:pPr>
+            <w:r>
+              <w:rPr>
+                <w:b/>
+                <w:color w:val="17324D"/>
+              </w:rPr>
+              <w:t xml:space="preserve">Why it matters</w:t>
+            </w:r>
+          </w:p>
+        </w:tc>
+        <w:tc>
+          <w:tcPr>
+            <w:tcW w:w="7100" w:type="dxa"/>
+            <w:shd w:val="clear" w:color="auto" w:fill="FFFFFF"/>
+            <w:vAlign w:val="top"/>
+          </w:tcPr>
+          <w:p>
+            <w:pPr>
+              <w:keepNext/>
+              <w:keepLines/>
+              <w:spacing w:before="0" w:after="0"/>
+            </w:pPr>
+            <w:r>
+              <w:rPr>
+                <w:color w:val="203040"/>
+              </w:rPr>
+              <w:t xml:space="preserve">Both herbs warm the middle, disperse cold, and settle nausea. The distinction matters because Gao Liang jiang is classified as Herbs that Warm the Interior and Expel Cold, while Sheng Jiang is classified as Warm, Acrid Herbs that Release the Exterior. The exam may test whether you move beyond the shared action and identify the correct clinical context.</w:t>
+            </w:r>
+          </w:p>
+        </w:tc>
+      </w:tr>
+      <w:tr>
+        <w:trPr>
+          <w:cantSplit/>
+        </w:trPr>
+        <w:tc>
+          <w:tcPr>
+            <w:tcW w:w="1900" w:type="dxa"/>
+            <w:shd w:val="clear" w:color="auto" w:fill="F2F6F8"/>
+            <w:vAlign w:val="top"/>
+          </w:tcPr>
+          <w:p>
+            <w:pPr>
+              <w:keepNext/>
+              <w:keepLines/>
+              <w:spacing w:before="0" w:after="0"/>
+            </w:pPr>
+            <w:r>
+              <w:rPr>
+                <w:b/>
+                <w:color w:val="17324D"/>
+              </w:rPr>
+              <w:t xml:space="preserve">Common confusion</w:t>
+            </w:r>
+          </w:p>
+        </w:tc>
+        <w:tc>
+          <w:tcPr>
+            <w:tcW w:w="7100" w:type="dxa"/>
+            <w:shd w:val="clear" w:color="auto" w:fill="FFFFFF"/>
+            <w:vAlign w:val="top"/>
+          </w:tcPr>
+          <w:p>
+            <w:pPr>
+              <w:keepNext/>
+              <w:keepLines/>
+              <w:spacing w:before="0" w:after="0"/>
+            </w:pPr>
+            <w:r>
+              <w:rPr>
+                <w:color w:val="203040"/>
+              </w:rPr>
+              <w:t xml:space="preserve">Vomiting, Loss of appetite appear in both clue sets, so those findings alone do not separate the herbs. Look for Abdominal pain, Diarrhea, Acid reflux to favor Gao Liang jiang, versus Common cold, Nasal congestion, Coughing to favor Sheng Jiang.</w:t>
+            </w:r>
+          </w:p>
+        </w:tc>
+      </w:tr>
+      <w:tr>
+        <w:trPr>
+          <w:cantSplit/>
+        </w:trPr>
+        <w:tc>
+          <w:tcPr>
+            <w:tcW w:w="1900" w:type="dxa"/>
+            <w:shd w:val="clear" w:color="auto" w:fill="F2F6F8"/>
+            <w:vAlign w:val="top"/>
+          </w:tcPr>
+          <w:p>
+            <w:pPr>
+              <w:keepNext/>
+              <w:keepLines/>
+              <w:spacing w:before="0" w:after="0"/>
+            </w:pPr>
+            <w:r>
+              <w:rPr>
+                <w:b/>
+                <w:color w:val="17324D"/>
+              </w:rPr>
+              <w:t xml:space="preserve">How it may appear</w:t>
+            </w:r>
+          </w:p>
+        </w:tc>
+        <w:tc>
+          <w:tcPr>
+            <w:tcW w:w="7100" w:type="dxa"/>
+            <w:shd w:val="clear" w:color="auto" w:fill="FFFFFF"/>
+            <w:vAlign w:val="top"/>
+          </w:tcPr>
+          <w:p>
+            <w:pPr>
+              <w:keepNext/>
+              <w:keepLines/>
+              <w:spacing w:before="0" w:after="0"/>
+            </w:pPr>
+            <w:r>
+              <w:rPr>
+                <w:color w:val="203040"/>
+              </w:rPr>
+              <w:t xml:space="preserve">A vignette emphasizing Abdominal pain, Diarrhea, Acid reflux could ask for the better match: Gao Liang jiang. A second vignette emphasizing Common cold, Nasal congestion, Coughing could point to Sheng Jiang. The same distinction may also appear as a category or formula-association question.</w:t>
+            </w:r>
+          </w:p>
+        </w:tc>
+      </w:tr>
+      <w:tr>
+        <w:trPr>
+          <w:cantSplit/>
+        </w:trPr>
+        <w:tc>
+          <w:tcPr>
+            <w:tcW w:w="1900" w:type="dxa"/>
+            <w:shd w:val="clear" w:color="auto" w:fill="F2F6F8"/>
+            <w:vAlign w:val="top"/>
+          </w:tcPr>
+          <w:p>
+            <w:pPr>
+              <w:keepLines/>
+              <w:spacing w:before="0" w:after="0"/>
+            </w:pPr>
+            <w:r>
+              <w:rPr>
+                <w:b/>
+                <w:color w:val="17324D"/>
+              </w:rPr>
+              <w:t xml:space="preserve">Why a switched match is wrong</w:t>
+            </w:r>
+          </w:p>
+        </w:tc>
+        <w:tc>
+          <w:tcPr>
+            <w:tcW w:w="7100" w:type="dxa"/>
+            <w:shd w:val="clear" w:color="auto" w:fill="FFFFFF"/>
+            <w:vAlign w:val="top"/>
+          </w:tcPr>
+          <w:p>
+            <w:pPr>
+              <w:keepLines/>
+              <w:spacing w:before="0" w:after="0"/>
+            </w:pPr>
+            <w:r>
+              <w:rPr>
+                <w:color w:val="203040"/>
+              </w:rPr>
+              <w:t xml:space="preserve">Reversing the match would attach the Herbs that Warm the Interior and Expel Cold associations to Sheng Jiang and the Warm, Acrid Herbs that Release the Exterior associations to Gao Liang jiang. That changes the source classification and makes the pairing incorrect.</w:t>
+            </w:r>
+          </w:p>
+        </w:tc>
+      </w:tr>
+    </w:tbl>
+    <w:p>
       <w:pPr>
-        <w:keepNext/>
-        <w:spacing w:before="100" w:after="50"/>
+        <w:spacing w:before="0" w:after="120"/>
       </w:pPr>
       <w:r>
-        <w:rPr>
-          <w:b/>
-          <w:color w:val="17324D"/>
-        </w:rPr>
-        <w:t xml:space="preserve">Why these matches are correct</w:t>
-      </w:r>
-    </w:p>
-    <w:p>
-      <w:pPr>
-        <w:keepLines/>
-        <w:spacing w:before="0" w:after="100"/>
-        <w:ind w:left="180" w:right="120"/>
-        <w:shd w:val="clear" w:color="auto" w:fill="EAF6EE"/>
-        <w:pBdr>
-          <w:left w:val="single" w:sz="20" w:space="8" w:color="2E8B57"/>
-        </w:pBdr>
-      </w:pPr>
-      <w:r>
-        <w:rPr>
-          <w:color w:val="245B38"/>
-        </w:rPr>
-        <w:t xml:space="preserve">For the matching exercise “Comparison Alpiniae officinarum Rhizoma (gao liang jiang) Vs. Zingiberis Rhizoma recens (sheng jiang)”, the source key distinguishes the items by their classification and keyed associations, not by shared symptoms or actions alone.</w:t>
-      </w:r>
-      <w:r>
-        <w:br/>
-      </w:r>
-      <w:r>
-        <w:rPr>
-          <w:color w:val="245B38"/>
-        </w:rPr>
-        <w:t xml:space="preserve">Match 1 — Alpiniae officinarum Rhizoma (gao liang jiang): classified as Herbs that Warm the Interior and Expel Cold; paired with the 2 formula associations shown in its comparison column.</w:t>
-      </w:r>
-      <w:r>
-        <w:br/>
-      </w:r>
-      <w:r>
-        <w:rPr>
-          <w:color w:val="245B38"/>
-        </w:rPr>
-        <w:t xml:space="preserve">Match 2 — Zingiberis Rhizoma recens (sheng jiang): classified as Warm, Acrid Herbs that Release the Exterior; paired with the 6 formula associations shown in its comparison column.</w:t>
-      </w:r>
-    </w:p>
-    <w:p>
-      <w:pPr>
-        <w:keepNext/>
-        <w:spacing w:before="100" w:after="50"/>
-      </w:pPr>
-      <w:r>
-        <w:rPr>
-          <w:b/>
-          <w:color w:val="17324D"/>
-        </w:rPr>
-        <w:t xml:space="preserve">How incorrect matches are evaluated</w:t>
-      </w:r>
-    </w:p>
-    <w:p>
-      <w:pPr>
-        <w:keepLines/>
-        <w:spacing w:before="0" w:after="80"/>
-        <w:ind w:left="180" w:right="120"/>
-        <w:shd w:val="clear" w:color="auto" w:fill="FDF1F1"/>
-        <w:pBdr>
-          <w:left w:val="single" w:sz="20" w:space="8" w:color="C96D6D"/>
-        </w:pBdr>
-      </w:pPr>
-      <w:r>
-        <w:rPr>
-          <w:color w:val="6B3030"/>
-        </w:rPr>
-        <w:t xml:space="preserve">Keep each item with the classification and association group shown in its comparison table. Interchanging the groups for Alpiniae officinarum Rhizoma (gao liang jiang) and Zingiberis Rhizoma recens (sheng jiang) would attach the source associations to the wrong item and is evaluated as an incorrect match.</w:t>
+        <w:t xml:space="preserve"/>
       </w:r>
     </w:p>
     <w:p>
@@ -1250,7 +1038,7 @@
         <w:color w:val="527286"/>
         <w:sz w:val="17"/>
       </w:rPr>
-      <w:t xml:space="preserve">AcupunctureTests  •  Page </w:t>
+      <w:t xml:space="preserve">Page </w:t>
     </w:r>
     <w:fldSimple w:instr=" PAGE ">
       <w:r>
@@ -1281,7 +1069,7 @@
         <w:color w:val="527286"/>
         <w:sz w:val="17"/>
       </w:rPr>
-      <w:t>Herb Comparison — Matching Review</w:t>
+      <w:t/>
     </w:r>
   </w:p>
 </w:hdr>

</xml_diff>

<commit_message>
Fit matching study guide to one page
</commit_message>
<xml_diff>
--- a/mod/scorm/studytopic/samples/Real_Herb_Comparison_Matching_Polished_Preview.docx
+++ b/mod/scorm/studytopic/samples/Real_Herb_Comparison_Matching_Polished_Preview.docx
@@ -4,93 +4,17 @@
   <w:body>
     <w:p>
       <w:pPr>
-        <w:pStyle w:val="Title"/>
-        <w:spacing w:before="0" w:after="120"/>
+        <w:pStyle w:val="Heading1"/>
+        <w:keepLines/>
+        <w:spacing w:before="0" w:after="50"/>
       </w:pPr>
       <w:r>
-        <w:t xml:space="preserve">Matching Study Guide Index</w:t>
-      </w:r>
-    </w:p>
-    <w:p>
-      <w:pPr>
-        <w:spacing w:before="0" w:after="180"/>
-      </w:pPr>
-      <w:r>
-        <w:rPr>
-          <w:color w:val="527286"/>
-          <w:sz w:val="22"/>
-          <w:szCs w:val="22"/>
-        </w:rPr>
-        <w:t xml:space="preserve">1 Matching question · 1 category</w:t>
-      </w:r>
-    </w:p>
-    <w:p>
-      <w:pPr>
-        <w:keepLines/>
-        <w:spacing w:before="0" w:after="180"/>
-        <w:ind w:left="180" w:right="120"/>
-        <w:shd w:val="clear" w:color="auto" w:fill="E8F3F5"/>
-        <w:pBdr>
-          <w:left w:val="single" w:sz="20" w:space="8" w:color="F47E2C"/>
-        </w:pBdr>
-      </w:pPr>
-      <w:r>
-        <w:rPr>
-          <w:i/>
-          <w:color w:val="31586B"/>
-        </w:rPr>
-        <w:t xml:space="preserve">Comparisons are grouped and sorted by the category of the first herb.</w:t>
-      </w:r>
-    </w:p>
-    <w:p>
-      <w:pPr>
-        <w:pStyle w:val="Heading2"/>
-        <w:keepNext/>
-        <w:spacing w:before="120" w:after="70"/>
-      </w:pPr>
-      <w:r>
-        <w:rPr>
-          <w:color w:val="17324D"/>
-        </w:rPr>
-        <w:t xml:space="preserve">Herbs that Warm the Interior and Expel Cold (1)</w:t>
-      </w:r>
-    </w:p>
-    <w:p>
-      <w:pPr>
-        <w:keepLines/>
-        <w:spacing w:before="0" w:after="70"/>
-        <w:ind w:left="180" w:right="120"/>
-        <w:shd w:val="clear" w:color="auto" w:fill="FFF6E8"/>
-        <w:pBdr>
-          <w:left w:val="single" w:sz="20" w:space="8" w:color="F47E2C"/>
-        </w:pBdr>
-      </w:pPr>
-      <w:r>
-        <w:rPr>
-          <w:b/>
-          <w:color w:val="8A3F0A"/>
-        </w:rPr>
         <w:t xml:space="preserve">(gao liang jiang) vs. (sheng jiang)</w:t>
-      </w:r>
-    </w:p>
-    <w:p>
-      <w:r>
-        <w:br w:type="page"/>
-      </w:r>
-    </w:p>
-    <w:p>
-      <w:pPr>
-        <w:pStyle w:val="Heading1"/>
-        <w:keepLines/>
-        <w:spacing w:before="0" w:after="120"/>
-      </w:pPr>
-      <w:r>
-        <w:t xml:space="preserve">Comparison Alpiniae officinarum Rhizoma (gao liang jiang) Vs. Zingiberis Rhizoma recens (sheng jiang)</w:t>
       </w:r>
     </w:p>
     <w:tbl>
       <w:tblPr>
-        <w:tblW w:w="9000" w:type="dxa"/>
+        <w:tblW w:w="14000" w:type="dxa"/>
         <w:tblLayout w:type="fixed"/>
         <w:tblBorders>
           <w:top w:val="single" w:sz="8" w:color="D6E1E7"/>
@@ -101,16 +25,16 @@
           <w:insideV w:val="single" w:sz="6" w:color="D6E1E7"/>
         </w:tblBorders>
         <w:tblCellMar>
-          <w:top w:w="100" w:type="dxa"/>
-          <w:left w:w="110" w:type="dxa"/>
-          <w:bottom w:w="100" w:type="dxa"/>
-          <w:right w:w="110" w:type="dxa"/>
+          <w:top w:w="45" w:type="dxa"/>
+          <w:left w:w="60" w:type="dxa"/>
+          <w:bottom w:w="45" w:type="dxa"/>
+          <w:right w:w="60" w:type="dxa"/>
         </w:tblCellMar>
       </w:tblPr>
       <w:tblGrid>
-        <w:gridCol w:w="1500"/>
-        <w:gridCol w:w="3750"/>
-        <w:gridCol w:w="3750"/>
+        <w:gridCol w:w="1800"/>
+        <w:gridCol w:w="6100"/>
+        <w:gridCol w:w="6100"/>
       </w:tblGrid>
       <w:tr>
         <w:trPr>
@@ -119,7 +43,7 @@
         <w:tc>
           <w:tcPr>
             <w:gridSpan w:val="3"/>
-            <w:tcW w:w="9000" w:type="dxa"/>
+            <w:tcW w:w="14000" w:type="dxa"/>
             <w:shd w:val="clear" w:color="auto" w:fill="527286"/>
             <w:vAlign w:val="top"/>
           </w:tcPr>
@@ -133,6 +57,8 @@
               <w:rPr>
                 <w:b/>
                 <w:color w:val="FFFFFF"/>
+                <w:sz w:val="16"/>
+                <w:szCs w:val="16"/>
               </w:rPr>
               <w:t xml:space="preserve">Study tip · Clues to help answer</w:t>
             </w:r>
@@ -145,7 +71,7 @@
         </w:trPr>
         <w:tc>
           <w:tcPr>
-            <w:tcW w:w="1500" w:type="dxa"/>
+            <w:tcW w:w="1800" w:type="dxa"/>
             <w:shd w:val="clear" w:color="auto" w:fill="DDEAF0"/>
             <w:vAlign w:val="top"/>
           </w:tcPr>
@@ -159,6 +85,8 @@
               <w:rPr>
                 <w:b/>
                 <w:color w:val="203040"/>
+                <w:sz w:val="16"/>
+                <w:szCs w:val="16"/>
               </w:rPr>
               <w:t xml:space="preserve">Clue</w:t>
             </w:r>
@@ -166,7 +94,7 @@
         </w:tc>
         <w:tc>
           <w:tcPr>
-            <w:tcW w:w="3750" w:type="dxa"/>
+            <w:tcW w:w="6100" w:type="dxa"/>
             <w:shd w:val="clear" w:color="auto" w:fill="DDEAF0"/>
             <w:vAlign w:val="top"/>
           </w:tcPr>
@@ -180,6 +108,8 @@
               <w:rPr>
                 <w:b/>
                 <w:color w:val="203040"/>
+                <w:sz w:val="16"/>
+                <w:szCs w:val="16"/>
               </w:rPr>
               <w:t xml:space="preserve">Gao Liang jiang</w:t>
             </w:r>
@@ -187,7 +117,7 @@
         </w:tc>
         <w:tc>
           <w:tcPr>
-            <w:tcW w:w="3750" w:type="dxa"/>
+            <w:tcW w:w="6100" w:type="dxa"/>
             <w:shd w:val="clear" w:color="auto" w:fill="DDEAF0"/>
             <w:vAlign w:val="top"/>
           </w:tcPr>
@@ -201,6 +131,8 @@
               <w:rPr>
                 <w:b/>
                 <w:color w:val="203040"/>
+                <w:sz w:val="16"/>
+                <w:szCs w:val="16"/>
               </w:rPr>
               <w:t xml:space="preserve">Sheng Jiang</w:t>
             </w:r>
@@ -213,7 +145,7 @@
         </w:trPr>
         <w:tc>
           <w:tcPr>
-            <w:tcW w:w="1500" w:type="dxa"/>
+            <w:tcW w:w="1800" w:type="dxa"/>
             <w:shd w:val="clear" w:color="auto" w:fill="FFE4B8"/>
             <w:vAlign w:val="top"/>
           </w:tcPr>
@@ -227,6 +159,8 @@
               <w:rPr>
                 <w:b/>
                 <w:color w:val="8A3F0A"/>
+                <w:sz w:val="16"/>
+                <w:szCs w:val="16"/>
               </w:rPr>
               <w:t xml:space="preserve">Shared clues</w:t>
             </w:r>
@@ -235,7 +169,7 @@
         <w:tc>
           <w:tcPr>
             <w:gridSpan w:val="2"/>
-            <w:tcW w:w="7500" w:type="dxa"/>
+            <w:tcW w:w="12200" w:type="dxa"/>
             <w:shd w:val="clear" w:color="auto" w:fill="FFF6E8"/>
             <w:vAlign w:val="top"/>
           </w:tcPr>
@@ -249,6 +183,8 @@
               <w:rPr>
                 <w:b/>
                 <w:color w:val="8A3F0A"/>
+                <w:sz w:val="16"/>
+                <w:szCs w:val="16"/>
               </w:rPr>
               <w:t xml:space="preserve">Both herbs warm the middle, disperse cold, and settle nausea.</w:t>
             </w:r>
@@ -261,7 +197,7 @@
         </w:trPr>
         <w:tc>
           <w:tcPr>
-            <w:tcW w:w="1500" w:type="dxa"/>
+            <w:tcW w:w="1800" w:type="dxa"/>
             <w:shd w:val="clear" w:color="auto" w:fill="F2F6F8"/>
             <w:vAlign w:val="top"/>
           </w:tcPr>
@@ -274,6 +210,8 @@
               <w:rPr>
                 <w:b/>
                 <w:color w:val="17324D"/>
+                <w:sz w:val="16"/>
+                <w:szCs w:val="16"/>
               </w:rPr>
               <w:t xml:space="preserve">Symptoms / conditions</w:t>
             </w:r>
@@ -281,7 +219,7 @@
         </w:tc>
         <w:tc>
           <w:tcPr>
-            <w:tcW w:w="3750" w:type="dxa"/>
+            <w:tcW w:w="6100" w:type="dxa"/>
             <w:shd w:val="clear" w:color="auto" w:fill="FFFFFF"/>
             <w:vAlign w:val="top"/>
           </w:tcPr>
@@ -293,6 +231,8 @@
             <w:r>
               <w:rPr>
                 <w:color w:val="203040"/>
+                <w:sz w:val="16"/>
+                <w:szCs w:val="16"/>
               </w:rPr>
               <w:t xml:space="preserve">• Abdominal pain</w:t>
             </w:r>
@@ -302,6 +242,8 @@
             <w:r>
               <w:rPr>
                 <w:color w:val="203040"/>
+                <w:sz w:val="16"/>
+                <w:szCs w:val="16"/>
               </w:rPr>
               <w:t xml:space="preserve">• Vomiting</w:t>
             </w:r>
@@ -311,6 +253,8 @@
             <w:r>
               <w:rPr>
                 <w:color w:val="203040"/>
+                <w:sz w:val="16"/>
+                <w:szCs w:val="16"/>
               </w:rPr>
               <w:t xml:space="preserve">• Diarrhea</w:t>
             </w:r>
@@ -320,6 +264,8 @@
             <w:r>
               <w:rPr>
                 <w:color w:val="203040"/>
+                <w:sz w:val="16"/>
+                <w:szCs w:val="16"/>
               </w:rPr>
               <w:t xml:space="preserve">• Acid reflux</w:t>
             </w:r>
@@ -329,6 +275,8 @@
             <w:r>
               <w:rPr>
                 <w:color w:val="203040"/>
+                <w:sz w:val="16"/>
+                <w:szCs w:val="16"/>
               </w:rPr>
               <w:t xml:space="preserve">• Loss of appetite</w:t>
             </w:r>
@@ -336,7 +284,7 @@
         </w:tc>
         <w:tc>
           <w:tcPr>
-            <w:tcW w:w="3750" w:type="dxa"/>
+            <w:tcW w:w="6100" w:type="dxa"/>
             <w:shd w:val="clear" w:color="auto" w:fill="FFFFFF"/>
             <w:vAlign w:val="top"/>
           </w:tcPr>
@@ -348,6 +296,8 @@
             <w:r>
               <w:rPr>
                 <w:color w:val="203040"/>
+                <w:sz w:val="16"/>
+                <w:szCs w:val="16"/>
               </w:rPr>
               <w:t xml:space="preserve">• Common cold</w:t>
             </w:r>
@@ -357,6 +307,8 @@
             <w:r>
               <w:rPr>
                 <w:color w:val="203040"/>
+                <w:sz w:val="16"/>
+                <w:szCs w:val="16"/>
               </w:rPr>
               <w:t xml:space="preserve">• Nasal congestion</w:t>
             </w:r>
@@ -366,6 +318,8 @@
             <w:r>
               <w:rPr>
                 <w:color w:val="203040"/>
+                <w:sz w:val="16"/>
+                <w:szCs w:val="16"/>
               </w:rPr>
               <w:t xml:space="preserve">• Coughing</w:t>
             </w:r>
@@ -375,6 +329,8 @@
             <w:r>
               <w:rPr>
                 <w:color w:val="203040"/>
+                <w:sz w:val="16"/>
+                <w:szCs w:val="16"/>
               </w:rPr>
               <w:t xml:space="preserve">• Food poisoning from seafood</w:t>
             </w:r>
@@ -384,6 +340,8 @@
             <w:r>
               <w:rPr>
                 <w:color w:val="203040"/>
+                <w:sz w:val="16"/>
+                <w:szCs w:val="16"/>
               </w:rPr>
               <w:t xml:space="preserve">• Loss of appetite</w:t>
             </w:r>
@@ -393,6 +351,8 @@
             <w:r>
               <w:rPr>
                 <w:color w:val="203040"/>
+                <w:sz w:val="16"/>
+                <w:szCs w:val="16"/>
               </w:rPr>
               <w:t xml:space="preserve">• Morning sickness</w:t>
             </w:r>
@@ -402,6 +362,8 @@
             <w:r>
               <w:rPr>
                 <w:color w:val="203040"/>
+                <w:sz w:val="16"/>
+                <w:szCs w:val="16"/>
               </w:rPr>
               <w:t xml:space="preserve">• Vomiting</w:t>
             </w:r>
@@ -411,6 +373,8 @@
             <w:r>
               <w:rPr>
                 <w:color w:val="203040"/>
+                <w:sz w:val="16"/>
+                <w:szCs w:val="16"/>
               </w:rPr>
               <w:t xml:space="preserve">• Phlegm</w:t>
             </w:r>
@@ -420,6 +384,8 @@
             <w:r>
               <w:rPr>
                 <w:color w:val="203040"/>
+                <w:sz w:val="16"/>
+                <w:szCs w:val="16"/>
               </w:rPr>
               <w:t xml:space="preserve">• Drug poisoning</w:t>
             </w:r>
@@ -429,28 +395,15 @@
     </w:tbl>
     <w:p>
       <w:pPr>
-        <w:spacing w:before="0" w:after="120"/>
+        <w:spacing w:before="0" w:after="30"/>
       </w:pPr>
       <w:r>
         <w:t xml:space="preserve"/>
       </w:r>
     </w:p>
-    <w:p>
-      <w:pPr>
-        <w:keepNext/>
-        <w:spacing w:before="0" w:after="100"/>
-      </w:pPr>
-      <w:r>
-        <w:rPr>
-          <w:b/>
-          <w:color w:val="17324D"/>
-        </w:rPr>
-        <w:t xml:space="preserve">Correct matches</w:t>
-      </w:r>
-    </w:p>
     <w:tbl>
       <w:tblPr>
-        <w:tblW w:w="9000" w:type="dxa"/>
+        <w:tblW w:w="14000" w:type="dxa"/>
         <w:tblLayout w:type="fixed"/>
         <w:tblBorders>
           <w:top w:val="single" w:sz="8" w:color="D6E1E7"/>
@@ -461,16 +414,16 @@
           <w:insideV w:val="single" w:sz="6" w:color="D6E1E7"/>
         </w:tblBorders>
         <w:tblCellMar>
-          <w:top w:w="100" w:type="dxa"/>
-          <w:left w:w="110" w:type="dxa"/>
-          <w:bottom w:w="100" w:type="dxa"/>
-          <w:right w:w="110" w:type="dxa"/>
+          <w:top w:w="45" w:type="dxa"/>
+          <w:left w:w="60" w:type="dxa"/>
+          <w:bottom w:w="45" w:type="dxa"/>
+          <w:right w:w="60" w:type="dxa"/>
         </w:tblCellMar>
       </w:tblPr>
       <w:tblGrid>
-        <w:gridCol w:w="1500"/>
-        <w:gridCol w:w="3750"/>
-        <w:gridCol w:w="3750"/>
+        <w:gridCol w:w="1800"/>
+        <w:gridCol w:w="6100"/>
+        <w:gridCol w:w="6100"/>
       </w:tblGrid>
       <w:tr>
         <w:trPr>
@@ -479,7 +432,7 @@
         <w:tc>
           <w:tcPr>
             <w:gridSpan w:val="3"/>
-            <w:tcW w:w="9000" w:type="dxa"/>
+            <w:tcW w:w="14000" w:type="dxa"/>
             <w:shd w:val="clear" w:color="auto" w:fill="F47E2C"/>
             <w:vAlign w:val="top"/>
           </w:tcPr>
@@ -493,6 +446,8 @@
               <w:rPr>
                 <w:b/>
                 <w:color w:val="FFFFFF"/>
+                <w:sz w:val="16"/>
+                <w:szCs w:val="16"/>
               </w:rPr>
               <w:t xml:space="preserve">Comparative answer key</w:t>
             </w:r>
@@ -505,7 +460,7 @@
         </w:trPr>
         <w:tc>
           <w:tcPr>
-            <w:tcW w:w="1500" w:type="dxa"/>
+            <w:tcW w:w="1800" w:type="dxa"/>
             <w:shd w:val="clear" w:color="auto" w:fill="DDEAF0"/>
             <w:vAlign w:val="top"/>
           </w:tcPr>
@@ -519,6 +474,8 @@
               <w:rPr>
                 <w:b/>
                 <w:color w:val="203040"/>
+                <w:sz w:val="16"/>
+                <w:szCs w:val="16"/>
               </w:rPr>
               <w:t xml:space="preserve">Compare</w:t>
             </w:r>
@@ -526,7 +483,7 @@
         </w:tc>
         <w:tc>
           <w:tcPr>
-            <w:tcW w:w="3750" w:type="dxa"/>
+            <w:tcW w:w="6100" w:type="dxa"/>
             <w:shd w:val="clear" w:color="auto" w:fill="DDEAF0"/>
             <w:vAlign w:val="top"/>
           </w:tcPr>
@@ -540,6 +497,8 @@
               <w:rPr>
                 <w:b/>
                 <w:color w:val="203040"/>
+                <w:sz w:val="16"/>
+                <w:szCs w:val="16"/>
               </w:rPr>
               <w:t xml:space="preserve">Alpiniae officinarum Rhizoma (gao liang jiang)</w:t>
             </w:r>
@@ -547,7 +506,7 @@
         </w:tc>
         <w:tc>
           <w:tcPr>
-            <w:tcW w:w="3750" w:type="dxa"/>
+            <w:tcW w:w="6100" w:type="dxa"/>
             <w:shd w:val="clear" w:color="auto" w:fill="DDEAF0"/>
             <w:vAlign w:val="top"/>
           </w:tcPr>
@@ -561,6 +520,8 @@
               <w:rPr>
                 <w:b/>
                 <w:color w:val="203040"/>
+                <w:sz w:val="16"/>
+                <w:szCs w:val="16"/>
               </w:rPr>
               <w:t xml:space="preserve">Zingiberis Rhizoma recens (sheng jiang)</w:t>
             </w:r>
@@ -573,7 +534,7 @@
         </w:trPr>
         <w:tc>
           <w:tcPr>
-            <w:tcW w:w="1500" w:type="dxa"/>
+            <w:tcW w:w="1800" w:type="dxa"/>
             <w:shd w:val="clear" w:color="auto" w:fill="F2F6F8"/>
             <w:vAlign w:val="top"/>
           </w:tcPr>
@@ -587,6 +548,8 @@
               <w:rPr>
                 <w:b/>
                 <w:color w:val="17324D"/>
+                <w:sz w:val="16"/>
+                <w:szCs w:val="16"/>
               </w:rPr>
               <w:t xml:space="preserve">Category</w:t>
             </w:r>
@@ -594,7 +557,7 @@
         </w:tc>
         <w:tc>
           <w:tcPr>
-            <w:tcW w:w="3750" w:type="dxa"/>
+            <w:tcW w:w="6100" w:type="dxa"/>
             <w:shd w:val="clear" w:color="auto" w:fill="FFFFFF"/>
             <w:vAlign w:val="top"/>
           </w:tcPr>
@@ -607,6 +570,8 @@
             <w:r>
               <w:rPr>
                 <w:color w:val="203040"/>
+                <w:sz w:val="16"/>
+                <w:szCs w:val="16"/>
               </w:rPr>
               <w:t xml:space="preserve">Herbs that Warm the Interior and Expel Cold.</w:t>
             </w:r>
@@ -614,7 +579,7 @@
         </w:tc>
         <w:tc>
           <w:tcPr>
-            <w:tcW w:w="3750" w:type="dxa"/>
+            <w:tcW w:w="6100" w:type="dxa"/>
             <w:shd w:val="clear" w:color="auto" w:fill="FFFFFF"/>
             <w:vAlign w:val="top"/>
           </w:tcPr>
@@ -627,6 +592,8 @@
             <w:r>
               <w:rPr>
                 <w:color w:val="203040"/>
+                <w:sz w:val="16"/>
+                <w:szCs w:val="16"/>
               </w:rPr>
               <w:t xml:space="preserve">Warm, Acrid Herbs that Release the Exterior.</w:t>
             </w:r>
@@ -639,7 +606,7 @@
         </w:trPr>
         <w:tc>
           <w:tcPr>
-            <w:tcW w:w="1500" w:type="dxa"/>
+            <w:tcW w:w="1800" w:type="dxa"/>
             <w:shd w:val="clear" w:color="auto" w:fill="F2F6F8"/>
             <w:vAlign w:val="top"/>
           </w:tcPr>
@@ -652,6 +619,8 @@
               <w:rPr>
                 <w:b/>
                 <w:color w:val="17324D"/>
+                <w:sz w:val="16"/>
+                <w:szCs w:val="16"/>
               </w:rPr>
               <w:t xml:space="preserve">Formulas</w:t>
             </w:r>
@@ -659,7 +628,7 @@
         </w:tc>
         <w:tc>
           <w:tcPr>
-            <w:tcW w:w="3750" w:type="dxa"/>
+            <w:tcW w:w="6100" w:type="dxa"/>
             <w:shd w:val="clear" w:color="auto" w:fill="FFFFFF"/>
             <w:vAlign w:val="top"/>
           </w:tcPr>
@@ -671,6 +640,8 @@
             <w:r>
               <w:rPr>
                 <w:color w:val="203040"/>
+                <w:sz w:val="16"/>
+                <w:szCs w:val="16"/>
               </w:rPr>
               <w:t xml:space="preserve">• Galangal and Cyperus Pill (liang fu wan)</w:t>
             </w:r>
@@ -680,6 +651,8 @@
             <w:r>
               <w:rPr>
                 <w:color w:val="203040"/>
+                <w:sz w:val="16"/>
+                <w:szCs w:val="16"/>
               </w:rPr>
               <w:t xml:space="preserve">• Top Quality Lindera Powder (tian tai wu yao san)</w:t>
             </w:r>
@@ -687,7 +660,7 @@
         </w:tc>
         <w:tc>
           <w:tcPr>
-            <w:tcW w:w="3750" w:type="dxa"/>
+            <w:tcW w:w="6100" w:type="dxa"/>
             <w:shd w:val="clear" w:color="auto" w:fill="FFFFFF"/>
             <w:vAlign w:val="top"/>
           </w:tcPr>
@@ -699,6 +672,8 @@
             <w:r>
               <w:rPr>
                 <w:color w:val="203040"/>
+                <w:sz w:val="16"/>
+                <w:szCs w:val="16"/>
               </w:rPr>
               <w:t xml:space="preserve">• Apricot Kernel and Perilla Leaf Powder (xing su san).</w:t>
             </w:r>
@@ -708,6 +683,8 @@
             <w:r>
               <w:rPr>
                 <w:color w:val="203040"/>
+                <w:sz w:val="16"/>
+                <w:szCs w:val="16"/>
               </w:rPr>
               <w:t xml:space="preserve">• Cinnamon Twig Decoction (gui zhi tang)</w:t>
             </w:r>
@@ -717,6 +694,8 @@
             <w:r>
               <w:rPr>
                 <w:color w:val="203040"/>
+                <w:sz w:val="16"/>
+                <w:szCs w:val="16"/>
               </w:rPr>
               <w:t xml:space="preserve">• Warm the Gallbladder Decoction (wen dan tang)</w:t>
             </w:r>
@@ -726,6 +705,8 @@
             <w:r>
               <w:rPr>
                 <w:color w:val="203040"/>
+                <w:sz w:val="16"/>
+                <w:szCs w:val="16"/>
               </w:rPr>
               <w:t xml:space="preserve">• Restore the Spleen Decoction (gui pi tang)</w:t>
             </w:r>
@@ -735,6 +716,8 @@
             <w:r>
               <w:rPr>
                 <w:color w:val="203040"/>
+                <w:sz w:val="16"/>
+                <w:szCs w:val="16"/>
               </w:rPr>
               <w:t xml:space="preserve">• Tangerine Peel and Bamboo Shavings Decoction (ju pi zhu ru tang)</w:t>
             </w:r>
@@ -744,6 +727,8 @@
             <w:r>
               <w:rPr>
                 <w:color w:val="203040"/>
+                <w:sz w:val="16"/>
+                <w:szCs w:val="16"/>
               </w:rPr>
               <w:t xml:space="preserve">• Minor Bupleurum Decoction (xiao chai hu tang)</w:t>
             </w:r>
@@ -753,20 +738,15 @@
     </w:tbl>
     <w:p>
       <w:pPr>
-        <w:spacing w:before="0" w:after="120"/>
+        <w:spacing w:before="0" w:after="30"/>
       </w:pPr>
       <w:r>
         <w:t xml:space="preserve"/>
       </w:r>
     </w:p>
-    <w:p>
-      <w:r>
-        <w:br w:type="page"/>
-      </w:r>
-    </w:p>
     <w:tbl>
       <w:tblPr>
-        <w:tblW w:w="9000" w:type="dxa"/>
+        <w:tblW w:w="14000" w:type="dxa"/>
         <w:tblLayout w:type="fixed"/>
         <w:tblBorders>
           <w:top w:val="single" w:sz="8" w:color="D6E1E7"/>
@@ -777,15 +757,15 @@
           <w:insideV w:val="single" w:sz="6" w:color="D6E1E7"/>
         </w:tblBorders>
         <w:tblCellMar>
-          <w:top w:w="100" w:type="dxa"/>
-          <w:left w:w="120" w:type="dxa"/>
-          <w:bottom w:w="100" w:type="dxa"/>
-          <w:right w:w="120" w:type="dxa"/>
+          <w:top w:w="45" w:type="dxa"/>
+          <w:left w:w="60" w:type="dxa"/>
+          <w:bottom w:w="45" w:type="dxa"/>
+          <w:right w:w="60" w:type="dxa"/>
         </w:tblCellMar>
       </w:tblPr>
       <w:tblGrid>
-        <w:gridCol w:w="1900"/>
-        <w:gridCol w:w="7100"/>
+        <w:gridCol w:w="2500"/>
+        <w:gridCol w:w="11500"/>
       </w:tblGrid>
       <w:tr>
         <w:trPr>
@@ -806,8 +786,8 @@
               <w:rPr>
                 <w:b/>
                 <w:color w:val="FFFFFF"/>
-                <w:sz w:val="22"/>
-                <w:szCs w:val="22"/>
+                <w:sz w:val="18"/>
+                <w:szCs w:val="18"/>
               </w:rPr>
               <w:t xml:space="preserve">Study guide · Exam focus</w:t>
             </w:r>
@@ -820,7 +800,7 @@
         </w:trPr>
         <w:tc>
           <w:tcPr>
-            <w:tcW w:w="1900" w:type="dxa"/>
+            <w:tcW w:w="2500" w:type="dxa"/>
             <w:shd w:val="clear" w:color="auto" w:fill="F2F6F8"/>
             <w:vAlign w:val="top"/>
           </w:tcPr>
@@ -834,6 +814,8 @@
               <w:rPr>
                 <w:b/>
                 <w:color w:val="17324D"/>
+                <w:sz w:val="16"/>
+                <w:szCs w:val="16"/>
               </w:rPr>
               <w:t xml:space="preserve">Why it matters</w:t>
             </w:r>
@@ -841,7 +823,7 @@
         </w:tc>
         <w:tc>
           <w:tcPr>
-            <w:tcW w:w="7100" w:type="dxa"/>
+            <w:tcW w:w="11500" w:type="dxa"/>
             <w:shd w:val="clear" w:color="auto" w:fill="FFFFFF"/>
             <w:vAlign w:val="top"/>
           </w:tcPr>
@@ -854,6 +836,8 @@
             <w:r>
               <w:rPr>
                 <w:color w:val="203040"/>
+                <w:sz w:val="16"/>
+                <w:szCs w:val="16"/>
               </w:rPr>
               <w:t xml:space="preserve">Both herbs warm the middle, disperse cold, and settle nausea. The distinction matters because Gao Liang jiang is classified as Herbs that Warm the Interior and Expel Cold, while Sheng Jiang is classified as Warm, Acrid Herbs that Release the Exterior. The exam may test whether you move beyond the shared action and identify the correct clinical context.</w:t>
             </w:r>
@@ -866,7 +850,7 @@
         </w:trPr>
         <w:tc>
           <w:tcPr>
-            <w:tcW w:w="1900" w:type="dxa"/>
+            <w:tcW w:w="2500" w:type="dxa"/>
             <w:shd w:val="clear" w:color="auto" w:fill="F2F6F8"/>
             <w:vAlign w:val="top"/>
           </w:tcPr>
@@ -880,6 +864,8 @@
               <w:rPr>
                 <w:b/>
                 <w:color w:val="17324D"/>
+                <w:sz w:val="16"/>
+                <w:szCs w:val="16"/>
               </w:rPr>
               <w:t xml:space="preserve">Common confusion</w:t>
             </w:r>
@@ -887,7 +873,7 @@
         </w:tc>
         <w:tc>
           <w:tcPr>
-            <w:tcW w:w="7100" w:type="dxa"/>
+            <w:tcW w:w="11500" w:type="dxa"/>
             <w:shd w:val="clear" w:color="auto" w:fill="FFFFFF"/>
             <w:vAlign w:val="top"/>
           </w:tcPr>
@@ -900,6 +886,8 @@
             <w:r>
               <w:rPr>
                 <w:color w:val="203040"/>
+                <w:sz w:val="16"/>
+                <w:szCs w:val="16"/>
               </w:rPr>
               <w:t xml:space="preserve">Vomiting, Loss of appetite appear in both clue sets, so those findings alone do not separate the herbs. Look for Abdominal pain, Diarrhea, Acid reflux to favor Gao Liang jiang, versus Common cold, Nasal congestion, Coughing to favor Sheng Jiang.</w:t>
             </w:r>
@@ -912,7 +900,7 @@
         </w:trPr>
         <w:tc>
           <w:tcPr>
-            <w:tcW w:w="1900" w:type="dxa"/>
+            <w:tcW w:w="2500" w:type="dxa"/>
             <w:shd w:val="clear" w:color="auto" w:fill="F2F6F8"/>
             <w:vAlign w:val="top"/>
           </w:tcPr>
@@ -926,6 +914,8 @@
               <w:rPr>
                 <w:b/>
                 <w:color w:val="17324D"/>
+                <w:sz w:val="16"/>
+                <w:szCs w:val="16"/>
               </w:rPr>
               <w:t xml:space="preserve">How it may appear</w:t>
             </w:r>
@@ -933,7 +923,7 @@
         </w:tc>
         <w:tc>
           <w:tcPr>
-            <w:tcW w:w="7100" w:type="dxa"/>
+            <w:tcW w:w="11500" w:type="dxa"/>
             <w:shd w:val="clear" w:color="auto" w:fill="FFFFFF"/>
             <w:vAlign w:val="top"/>
           </w:tcPr>
@@ -946,6 +936,8 @@
             <w:r>
               <w:rPr>
                 <w:color w:val="203040"/>
+                <w:sz w:val="16"/>
+                <w:szCs w:val="16"/>
               </w:rPr>
               <w:t xml:space="preserve">A vignette emphasizing Abdominal pain, Diarrhea, Acid reflux could ask for the better match: Gao Liang jiang. A second vignette emphasizing Common cold, Nasal congestion, Coughing could point to Sheng Jiang. The same distinction may also appear as a category or formula-association question.</w:t>
             </w:r>
@@ -958,7 +950,7 @@
         </w:trPr>
         <w:tc>
           <w:tcPr>
-            <w:tcW w:w="1900" w:type="dxa"/>
+            <w:tcW w:w="2500" w:type="dxa"/>
             <w:shd w:val="clear" w:color="auto" w:fill="F2F6F8"/>
             <w:vAlign w:val="top"/>
           </w:tcPr>
@@ -971,6 +963,8 @@
               <w:rPr>
                 <w:b/>
                 <w:color w:val="17324D"/>
+                <w:sz w:val="16"/>
+                <w:szCs w:val="16"/>
               </w:rPr>
               <w:t xml:space="preserve">Why a switched match is wrong</w:t>
             </w:r>
@@ -978,7 +972,7 @@
         </w:tc>
         <w:tc>
           <w:tcPr>
-            <w:tcW w:w="7100" w:type="dxa"/>
+            <w:tcW w:w="11500" w:type="dxa"/>
             <w:shd w:val="clear" w:color="auto" w:fill="FFFFFF"/>
             <w:vAlign w:val="top"/>
           </w:tcPr>
@@ -990,6 +984,8 @@
             <w:r>
               <w:rPr>
                 <w:color w:val="203040"/>
+                <w:sz w:val="16"/>
+                <w:szCs w:val="16"/>
               </w:rPr>
               <w:t xml:space="preserve">Reversing the match would attach the Herbs that Warm the Interior and Expel Cold associations to Sheng Jiang and the Warm, Acrid Herbs that Release the Exterior associations to Gao Liang jiang. That changes the source classification and makes the pairing incorrect.</w:t>
             </w:r>
@@ -999,7 +995,7 @@
     </w:tbl>
     <w:p>
       <w:pPr>
-        <w:spacing w:before="0" w:after="120"/>
+        <w:spacing w:before="0" w:after="30"/>
       </w:pPr>
       <w:r>
         <w:t xml:space="preserve"/>
@@ -1007,15 +1003,15 @@
     </w:p>
     <w:p>
       <w:pPr>
-        <w:spacing w:before="0" w:after="160"/>
+        <w:spacing w:before="0" w:after="20"/>
       </w:pPr>
       <w:r>
         <w:t xml:space="preserve"/>
       </w:r>
     </w:p>
     <w:sectPr>
-      <w:pgSz w:w="12240" w:h="15840"/>
-      <w:pgMar w:top="1080" w:right="900" w:bottom="1080" w:left="900" w:header="540" w:footer="540" w:gutter="0"/>
+      <w:pgSz w:w="15840" w:h="12240" w:orient="landscape"/>
+      <w:pgMar w:top="420" w:right="600" w:bottom="480" w:left="600" w:header="240" w:footer="240" w:gutter="0"/>
       <w:headerReference w:type="default" r:id="rId2"/>
       <w:footerReference w:type="default" r:id="rId3"/>
     </w:sectPr>
@@ -1082,14 +1078,14 @@
       <w:rPr>
         <w:rFonts w:ascii="Aptos" w:hAnsi="Aptos" w:eastAsia="Aptos"/>
         <w:color w:val="203040"/>
-        <w:sz w:val="21"/>
+        <w:sz w:val="16"/>
       </w:rPr>
     </w:rPrDefault>
   </w:docDefaults>
   <w:style w:type="paragraph" w:default="1" w:styleId="Normal">
     <w:name w:val="Normal"/>
     <w:pPr>
-      <w:spacing w:after="100" w:line="276" w:lineRule="auto"/>
+      <w:spacing w:after="100" w:line="205" w:lineRule="auto"/>
     </w:pPr>
   </w:style>
   <w:style w:type="paragraph" w:styleId="BookBrand">
@@ -1140,7 +1136,7 @@
     <w:pPr>
       <w:keepNext/>
       <w:keepLines/>
-      <w:spacing w:before="180" w:after="180"/>
+      <w:spacing w:before="30" w:after="60"/>
       <w:pBdr>
         <w:bottom w:val="single" w:sz="16" w:space="8" w:color="F47E2C"/>
       </w:pBdr>
@@ -1148,7 +1144,7 @@
     <w:rPr>
       <w:b/>
       <w:color w:val="17324D"/>
-      <w:sz w:val="32"/>
+      <w:sz w:val="24"/>
     </w:rPr>
   </w:style>
   <w:style w:type="paragraph" w:styleId="Heading2">

</xml_diff>

<commit_message>
Use full card titles and add study prompts
</commit_message>
<xml_diff>
--- a/mod/scorm/studytopic/samples/Real_Herb_Comparison_Matching_Polished_Preview.docx
+++ b/mod/scorm/studytopic/samples/Real_Herb_Comparison_Matching_Polished_Preview.docx
@@ -9,7 +9,7 @@
         <w:spacing w:before="0" w:after="50"/>
       </w:pPr>
       <w:r>
-        <w:t xml:space="preserve">(gao liang jiang) vs. (sheng jiang)</w:t>
+        <w:t xml:space="preserve">Alpiniae officinarum Rhizoma (gao liang jiang) vs. Zingiberis Rhizoma recens (sheng jiang)</w:t>
       </w:r>
     </w:p>
     <w:tbl>
@@ -988,6 +988,146 @@
                 <w:szCs w:val="16"/>
               </w:rPr>
               <w:t xml:space="preserve">Reversing the match would attach the Herbs that Warm the Interior and Expel Cold associations to Sheng Jiang and the Warm, Acrid Herbs that Release the Exterior associations to Gao Liang jiang. That changes the source classification and makes the pairing incorrect.</w:t>
+            </w:r>
+          </w:p>
+        </w:tc>
+      </w:tr>
+    </w:tbl>
+    <w:p>
+      <w:pPr>
+        <w:spacing w:before="0" w:after="30"/>
+      </w:pPr>
+      <w:r>
+        <w:t xml:space="preserve"/>
+      </w:r>
+    </w:p>
+    <w:tbl>
+      <w:tblPr>
+        <w:tblW w:w="14000" w:type="dxa"/>
+        <w:tblLayout w:type="fixed"/>
+        <w:tblBorders>
+          <w:top w:val="single" w:sz="8" w:color="D6E1E7"/>
+          <w:left w:val="single" w:sz="8" w:color="D6E1E7"/>
+          <w:bottom w:val="single" w:sz="8" w:color="D6E1E7"/>
+          <w:right w:val="single" w:sz="8" w:color="D6E1E7"/>
+          <w:insideH w:val="single" w:sz="6" w:color="D6E1E7"/>
+          <w:insideV w:val="single" w:sz="6" w:color="D6E1E7"/>
+        </w:tblBorders>
+        <w:tblCellMar>
+          <w:top w:w="45" w:type="dxa"/>
+          <w:left w:w="60" w:type="dxa"/>
+          <w:bottom w:w="45" w:type="dxa"/>
+          <w:right w:w="60" w:type="dxa"/>
+        </w:tblCellMar>
+      </w:tblPr>
+      <w:tblGrid>
+        <w:gridCol w:w="2500"/>
+        <w:gridCol w:w="11500"/>
+      </w:tblGrid>
+      <w:tr>
+        <w:trPr>
+          <w:cantSplit/>
+        </w:trPr>
+        <w:tc>
+          <w:tcPr>
+            <w:gridSpan w:val="2"/>
+            <w:shd w:val="clear" w:color="auto" w:fill="2E7D6B"/>
+          </w:tcPr>
+          <w:p>
+            <w:pPr>
+              <w:keepNext/>
+              <w:keepLines/>
+              <w:spacing w:before="0" w:after="0"/>
+            </w:pPr>
+            <w:r>
+              <w:rPr>
+                <w:b/>
+                <w:color w:val="FFFFFF"/>
+                <w:sz w:val="18"/>
+                <w:szCs w:val="18"/>
+              </w:rPr>
+              <w:t xml:space="preserve">Possible exam questions · Study prompts</w:t>
+            </w:r>
+          </w:p>
+        </w:tc>
+      </w:tr>
+      <w:tr>
+        <w:trPr>
+          <w:cantSplit/>
+        </w:trPr>
+        <w:tc>
+          <w:tcPr>
+            <w:tcW w:w="2500" w:type="dxa"/>
+            <w:shd w:val="clear" w:color="auto" w:fill="F2F6F8"/>
+            <w:vAlign w:val="top"/>
+          </w:tcPr>
+          <w:p>
+            <w:pPr>
+              <w:keepLines/>
+              <w:spacing w:before="0" w:after="0"/>
+            </w:pPr>
+            <w:r>
+              <w:rPr>
+                <w:b/>
+                <w:color w:val="17324D"/>
+                <w:sz w:val="16"/>
+                <w:szCs w:val="16"/>
+              </w:rPr>
+              <w:t xml:space="preserve">Practice</w:t>
+            </w:r>
+          </w:p>
+        </w:tc>
+        <w:tc>
+          <w:tcPr>
+            <w:tcW w:w="11500" w:type="dxa"/>
+            <w:shd w:val="clear" w:color="auto" w:fill="FFFFFF"/>
+            <w:vAlign w:val="top"/>
+          </w:tcPr>
+          <w:p>
+            <w:pPr>
+              <w:keepLines/>
+              <w:spacing w:before="0" w:after="0"/>
+            </w:pPr>
+            <w:r>
+              <w:rPr>
+                <w:color w:val="203040"/>
+                <w:sz w:val="16"/>
+                <w:szCs w:val="16"/>
+              </w:rPr>
+              <w:t xml:space="preserve">• Which category belongs to Alpiniae officinarum Rhizoma (gao liang jiang), and which belongs to Zingiberis Rhizoma recens (sheng jiang)?</w:t>
+            </w:r>
+            <w:r>
+              <w:br/>
+            </w:r>
+            <w:r>
+              <w:rPr>
+                <w:color w:val="203040"/>
+                <w:sz w:val="16"/>
+                <w:szCs w:val="16"/>
+              </w:rPr>
+              <w:t xml:space="preserve">• Which shared findings are least useful for distinguishing these two herbs?</w:t>
+            </w:r>
+            <w:r>
+              <w:br/>
+            </w:r>
+            <w:r>
+              <w:rPr>
+                <w:color w:val="203040"/>
+                <w:sz w:val="16"/>
+                <w:szCs w:val="16"/>
+              </w:rPr>
+              <w:t xml:space="preserve">• Which symptom cluster most strongly favors each herb?</w:t>
+            </w:r>
+            <w:r>
+              <w:br/>
+            </w:r>
+            <w:r>
+              <w:rPr>
+                <w:color w:val="203040"/>
+                <w:sz w:val="16"/>
+                <w:szCs w:val="16"/>
+              </w:rPr>
+              <w:t xml:space="preserve">• Which formula associations belong in each comparison column?</w:t>
             </w:r>
           </w:p>
         </w:tc>

</xml_diff>